<commit_message>
Add company details, employee questionnaire; fill company NPWP and address in PM contract
Co-Authored-By: Claude Opus 5.5 <noreply@anthropic.com>
Claude-Session: https://claude.ai/code/session_019RycNPa9Jvz3V4nJzmzduN
</commit_message>
<xml_diff>
--- a/company/hr/PKWTT-Oka-Sihotang-DRAFT.docx
+++ b/company/hr/PKWTT-Oka-Sihotang-DRAFT.docx
@@ -407,7 +407,7 @@
                 <w:sz w:val="19"/>
                 <w:szCs w:val="19"/>
               </w:rPr>
-              <w:t xml:space="preserve">1. PT IMPRESS YOURSELF CORP, a foreign investment limited liability company (PT PMA) established under the laws of the Republic of Indonesia, NIB </w:t>
+              <w:t xml:space="preserve">1. PT IMPRESS YOURSELF CORP, a foreign investment limited liability company (PT PMA) established under the laws of the Republic of Indonesia, Taxpayer Number (NPWP) 62.704.133.8-905.000, having its domicile at Jalan Penestanan, Desa Sayan, Kecamatan Ubud, Kabupaten Gianyar, Provinsi Bali, represented by MIKHAIL ZAVIALOV in his capacity as </w:t>
             </w:r>
             <w:r>
               <w:rPr>
@@ -417,15 +417,46 @@
                 <w:highlight w:val="yellow"/>
                 <w:highlightCs w:val="yellow"/>
               </w:rPr>
-              <w:t xml:space="preserve">[_____________]</w:t>
-            </w:r>
-            <w:r>
-              <w:rPr>
-                <w:rFonts w:ascii="Arial" w:cs="Arial" w:eastAsia="Arial" w:hAnsi="Arial"/>
-                <w:sz w:val="19"/>
-                <w:szCs w:val="19"/>
-              </w:rPr>
-              <w:t xml:space="preserve">, having its address at </w:t>
+              <w:t xml:space="preserve">[President Director]</w:t>
+            </w:r>
+            <w:r>
+              <w:rPr>
+                <w:rFonts w:ascii="Arial" w:cs="Arial" w:eastAsia="Arial" w:hAnsi="Arial"/>
+                <w:sz w:val="19"/>
+                <w:szCs w:val="19"/>
+              </w:rPr>
+              <w:t xml:space="preserve"> (the "Company");</w:t>
+            </w:r>
+          </w:p>
+        </w:tc>
+        <w:tc>
+          <w:tcPr>
+            <w:tcW w:type="dxa" w:w="4953"/>
+            <w:tcBorders>
+              <w:top w:val="single" w:color="BFBFBF" w:sz="4"/>
+              <w:left w:val="single" w:color="BFBFBF" w:sz="4"/>
+              <w:bottom w:val="single" w:color="BFBFBF" w:sz="4"/>
+              <w:right w:val="single" w:color="BFBFBF" w:sz="4"/>
+            </w:tcBorders>
+            <w:tcMar>
+              <w:top w:type="dxa" w:w="60"/>
+              <w:left w:type="dxa" w:w="100"/>
+              <w:bottom w:type="dxa" w:w="60"/>
+              <w:right w:type="dxa" w:w="100"/>
+            </w:tcMar>
+          </w:tcPr>
+          <w:p>
+            <w:pPr>
+              <w:spacing w:after="80"/>
+              <w:jc w:val="left"/>
+            </w:pPr>
+            <w:r>
+              <w:rPr>
+                <w:rFonts w:ascii="Arial" w:cs="Arial" w:eastAsia="Arial" w:hAnsi="Arial"/>
+                <w:sz w:val="19"/>
+                <w:szCs w:val="19"/>
+              </w:rPr>
+              <w:t xml:space="preserve">1. PT IMPRESS YOURSELF CORP, perseroan terbatas penanaman modal asing (PT PMA) yang didirikan berdasarkan hukum Negara Republik Indonesia, NPWP 62.704.133.8-905.000, berkedudukan di Jalan Penestanan, Desa Sayan, Kecamatan Ubud, Kabupaten Gianyar, Provinsi Bali, dalam hal ini diwakili oleh MIKHAIL ZAVIALOV selaku </w:t>
             </w:r>
             <w:r>
               <w:rPr>
@@ -435,15 +466,51 @@
                 <w:highlight w:val="yellow"/>
                 <w:highlightCs w:val="yellow"/>
               </w:rPr>
-              <w:t xml:space="preserve">[_____________________________]</w:t>
-            </w:r>
-            <w:r>
-              <w:rPr>
-                <w:rFonts w:ascii="Arial" w:cs="Arial" w:eastAsia="Arial" w:hAnsi="Arial"/>
-                <w:sz w:val="19"/>
-                <w:szCs w:val="19"/>
-              </w:rPr>
-              <w:t xml:space="preserve">, represented by MIKHAIL ZAVIALOV in his capacity as </w:t>
+              <w:t xml:space="preserve">[Direktur Utama]</w:t>
+            </w:r>
+            <w:r>
+              <w:rPr>
+                <w:rFonts w:ascii="Arial" w:cs="Arial" w:eastAsia="Arial" w:hAnsi="Arial"/>
+                <w:sz w:val="19"/>
+                <w:szCs w:val="19"/>
+              </w:rPr>
+              <w:t xml:space="preserve"> ("Perusahaan");</w:t>
+            </w:r>
+          </w:p>
+        </w:tc>
+      </w:tr>
+      <w:tr>
+        <w:trPr>
+          <w:cantSplit w:val="false"/>
+        </w:trPr>
+        <w:tc>
+          <w:tcPr>
+            <w:tcW w:type="dxa" w:w="4953"/>
+            <w:tcBorders>
+              <w:top w:val="single" w:color="BFBFBF" w:sz="4"/>
+              <w:left w:val="single" w:color="BFBFBF" w:sz="4"/>
+              <w:bottom w:val="single" w:color="BFBFBF" w:sz="4"/>
+              <w:right w:val="single" w:color="BFBFBF" w:sz="4"/>
+            </w:tcBorders>
+            <w:tcMar>
+              <w:top w:type="dxa" w:w="60"/>
+              <w:left w:type="dxa" w:w="100"/>
+              <w:bottom w:type="dxa" w:w="60"/>
+              <w:right w:type="dxa" w:w="100"/>
+            </w:tcMar>
+          </w:tcPr>
+          <w:p>
+            <w:pPr>
+              <w:spacing w:after="80"/>
+              <w:jc w:val="left"/>
+            </w:pPr>
+            <w:r>
+              <w:rPr>
+                <w:rFonts w:ascii="Arial" w:cs="Arial" w:eastAsia="Arial" w:hAnsi="Arial"/>
+                <w:sz w:val="19"/>
+                <w:szCs w:val="19"/>
+              </w:rPr>
+              <w:t xml:space="preserve">2. OKA SAHALA RAJAGEA SIHOTANG, Indonesian citizen, born in Pontianak on 4 December 1994, holder of Identity Card (KTP) NIK </w:t>
             </w:r>
             <w:r>
               <w:rPr>
@@ -453,46 +520,15 @@
                 <w:highlight w:val="yellow"/>
                 <w:highlightCs w:val="yellow"/>
               </w:rPr>
-              <w:t xml:space="preserve">[President Director]</w:t>
-            </w:r>
-            <w:r>
-              <w:rPr>
-                <w:rFonts w:ascii="Arial" w:cs="Arial" w:eastAsia="Arial" w:hAnsi="Arial"/>
-                <w:sz w:val="19"/>
-                <w:szCs w:val="19"/>
-              </w:rPr>
-              <w:t xml:space="preserve"> (the "Company");</w:t>
-            </w:r>
-          </w:p>
-        </w:tc>
-        <w:tc>
-          <w:tcPr>
-            <w:tcW w:type="dxa" w:w="4953"/>
-            <w:tcBorders>
-              <w:top w:val="single" w:color="BFBFBF" w:sz="4"/>
-              <w:left w:val="single" w:color="BFBFBF" w:sz="4"/>
-              <w:bottom w:val="single" w:color="BFBFBF" w:sz="4"/>
-              <w:right w:val="single" w:color="BFBFBF" w:sz="4"/>
-            </w:tcBorders>
-            <w:tcMar>
-              <w:top w:type="dxa" w:w="60"/>
-              <w:left w:type="dxa" w:w="100"/>
-              <w:bottom w:type="dxa" w:w="60"/>
-              <w:right w:type="dxa" w:w="100"/>
-            </w:tcMar>
-          </w:tcPr>
-          <w:p>
-            <w:pPr>
-              <w:spacing w:after="80"/>
-              <w:jc w:val="left"/>
-            </w:pPr>
-            <w:r>
-              <w:rPr>
-                <w:rFonts w:ascii="Arial" w:cs="Arial" w:eastAsia="Arial" w:hAnsi="Arial"/>
-                <w:sz w:val="19"/>
-                <w:szCs w:val="19"/>
-              </w:rPr>
-              <w:t xml:space="preserve">1. PT IMPRESS YOURSELF CORP, perseroan terbatas penanaman modal asing (PT PMA) yang didirikan berdasarkan hukum Negara Republik Indonesia, NIB </w:t>
+              <w:t xml:space="preserve">[________________]</w:t>
+            </w:r>
+            <w:r>
+              <w:rPr>
+                <w:rFonts w:ascii="Arial" w:cs="Arial" w:eastAsia="Arial" w:hAnsi="Arial"/>
+                <w:sz w:val="19"/>
+                <w:szCs w:val="19"/>
+              </w:rPr>
+              <w:t xml:space="preserve">, address as per KTP: Jl. M. Sohor Gg. Sederhana No. 34B, RT 004/RW 005, Kel. Akcaya, Kec. Pontianak Selatan, Kota Pontianak, Kalimantan Barat; current domicile in Bali: </w:t>
             </w:r>
             <w:r>
               <w:rPr>
@@ -502,15 +538,15 @@
                 <w:highlight w:val="yellow"/>
                 <w:highlightCs w:val="yellow"/>
               </w:rPr>
-              <w:t xml:space="preserve">[_____________]</w:t>
-            </w:r>
-            <w:r>
-              <w:rPr>
-                <w:rFonts w:ascii="Arial" w:cs="Arial" w:eastAsia="Arial" w:hAnsi="Arial"/>
-                <w:sz w:val="19"/>
-                <w:szCs w:val="19"/>
-              </w:rPr>
-              <w:t xml:space="preserve">, beralamat di </w:t>
+              <w:t xml:space="preserve">[_____________________________]</w:t>
+            </w:r>
+            <w:r>
+              <w:rPr>
+                <w:rFonts w:ascii="Arial" w:cs="Arial" w:eastAsia="Arial" w:hAnsi="Arial"/>
+                <w:sz w:val="19"/>
+                <w:szCs w:val="19"/>
+              </w:rPr>
+              <w:t xml:space="preserve">; phone: </w:t>
             </w:r>
             <w:r>
               <w:rPr>
@@ -520,15 +556,46 @@
                 <w:highlight w:val="yellow"/>
                 <w:highlightCs w:val="yellow"/>
               </w:rPr>
-              <w:t xml:space="preserve">[_____________________________]</w:t>
-            </w:r>
-            <w:r>
-              <w:rPr>
-                <w:rFonts w:ascii="Arial" w:cs="Arial" w:eastAsia="Arial" w:hAnsi="Arial"/>
-                <w:sz w:val="19"/>
-                <w:szCs w:val="19"/>
-              </w:rPr>
-              <w:t xml:space="preserve">, dalam hal ini diwakili oleh MIKHAIL ZAVIALOV selaku </w:t>
+              <w:t xml:space="preserve">[_____________]</w:t>
+            </w:r>
+            <w:r>
+              <w:rPr>
+                <w:rFonts w:ascii="Arial" w:cs="Arial" w:eastAsia="Arial" w:hAnsi="Arial"/>
+                <w:sz w:val="19"/>
+                <w:szCs w:val="19"/>
+              </w:rPr>
+              <w:t xml:space="preserve"> (the "Employee").</w:t>
+            </w:r>
+          </w:p>
+        </w:tc>
+        <w:tc>
+          <w:tcPr>
+            <w:tcW w:type="dxa" w:w="4953"/>
+            <w:tcBorders>
+              <w:top w:val="single" w:color="BFBFBF" w:sz="4"/>
+              <w:left w:val="single" w:color="BFBFBF" w:sz="4"/>
+              <w:bottom w:val="single" w:color="BFBFBF" w:sz="4"/>
+              <w:right w:val="single" w:color="BFBFBF" w:sz="4"/>
+            </w:tcBorders>
+            <w:tcMar>
+              <w:top w:type="dxa" w:w="60"/>
+              <w:left w:type="dxa" w:w="100"/>
+              <w:bottom w:type="dxa" w:w="60"/>
+              <w:right w:type="dxa" w:w="100"/>
+            </w:tcMar>
+          </w:tcPr>
+          <w:p>
+            <w:pPr>
+              <w:spacing w:after="80"/>
+              <w:jc w:val="left"/>
+            </w:pPr>
+            <w:r>
+              <w:rPr>
+                <w:rFonts w:ascii="Arial" w:cs="Arial" w:eastAsia="Arial" w:hAnsi="Arial"/>
+                <w:sz w:val="19"/>
+                <w:szCs w:val="19"/>
+              </w:rPr>
+              <w:t xml:space="preserve">2. OKA SAHALA RAJAGEA SIHOTANG, Warga Negara Indonesia, lahir di Pontianak pada tanggal 4 Desember 1994, pemegang Kartu Tanda Penduduk (KTP) NIK </w:t>
             </w:r>
             <w:r>
               <w:rPr>
@@ -538,118 +605,15 @@
                 <w:highlight w:val="yellow"/>
                 <w:highlightCs w:val="yellow"/>
               </w:rPr>
-              <w:t xml:space="preserve">[Direktur Utama]</w:t>
-            </w:r>
-            <w:r>
-              <w:rPr>
-                <w:rFonts w:ascii="Arial" w:cs="Arial" w:eastAsia="Arial" w:hAnsi="Arial"/>
-                <w:sz w:val="19"/>
-                <w:szCs w:val="19"/>
-              </w:rPr>
-              <w:t xml:space="preserve"> ("Perusahaan");</w:t>
-            </w:r>
-          </w:p>
-        </w:tc>
-      </w:tr>
-      <w:tr>
-        <w:trPr>
-          <w:cantSplit w:val="false"/>
-        </w:trPr>
-        <w:tc>
-          <w:tcPr>
-            <w:tcW w:type="dxa" w:w="4953"/>
-            <w:tcBorders>
-              <w:top w:val="single" w:color="BFBFBF" w:sz="4"/>
-              <w:left w:val="single" w:color="BFBFBF" w:sz="4"/>
-              <w:bottom w:val="single" w:color="BFBFBF" w:sz="4"/>
-              <w:right w:val="single" w:color="BFBFBF" w:sz="4"/>
-            </w:tcBorders>
-            <w:tcMar>
-              <w:top w:type="dxa" w:w="60"/>
-              <w:left w:type="dxa" w:w="100"/>
-              <w:bottom w:type="dxa" w:w="60"/>
-              <w:right w:type="dxa" w:w="100"/>
-            </w:tcMar>
-          </w:tcPr>
-          <w:p>
-            <w:pPr>
-              <w:spacing w:after="80"/>
-              <w:jc w:val="left"/>
-            </w:pPr>
-            <w:r>
-              <w:rPr>
-                <w:rFonts w:ascii="Arial" w:cs="Arial" w:eastAsia="Arial" w:hAnsi="Arial"/>
-                <w:sz w:val="19"/>
-                <w:szCs w:val="19"/>
-              </w:rPr>
-              <w:t xml:space="preserve">2. OKA SAHALA RAJAGEA SIHOTANG, Indonesian citizen, born in Pontianak on 4 December 1994, holder of Identity Card (KTP) NIK 6171010412940006, address as per KTP: Jl. M. Sohor Gg. Sederhana No. 34B, RT 004/RW 005, Kel. Akcaya, Kec. Pontianak Selatan, Kota Pontianak, Kalimantan Barat; current domicile in Bali: </w:t>
-            </w:r>
-            <w:r>
-              <w:rPr>
-                <w:rFonts w:ascii="Arial" w:cs="Arial" w:eastAsia="Arial" w:hAnsi="Arial"/>
-                <w:sz w:val="19"/>
-                <w:szCs w:val="19"/>
-                <w:highlight w:val="yellow"/>
-                <w:highlightCs w:val="yellow"/>
-              </w:rPr>
-              <w:t xml:space="preserve">[_____________________________]</w:t>
-            </w:r>
-            <w:r>
-              <w:rPr>
-                <w:rFonts w:ascii="Arial" w:cs="Arial" w:eastAsia="Arial" w:hAnsi="Arial"/>
-                <w:sz w:val="19"/>
-                <w:szCs w:val="19"/>
-              </w:rPr>
-              <w:t xml:space="preserve">; phone: </w:t>
-            </w:r>
-            <w:r>
-              <w:rPr>
-                <w:rFonts w:ascii="Arial" w:cs="Arial" w:eastAsia="Arial" w:hAnsi="Arial"/>
-                <w:sz w:val="19"/>
-                <w:szCs w:val="19"/>
-                <w:highlight w:val="yellow"/>
-                <w:highlightCs w:val="yellow"/>
-              </w:rPr>
-              <w:t xml:space="preserve">[_____________]</w:t>
-            </w:r>
-            <w:r>
-              <w:rPr>
-                <w:rFonts w:ascii="Arial" w:cs="Arial" w:eastAsia="Arial" w:hAnsi="Arial"/>
-                <w:sz w:val="19"/>
-                <w:szCs w:val="19"/>
-              </w:rPr>
-              <w:t xml:space="preserve"> (the "Employee").</w:t>
-            </w:r>
-          </w:p>
-        </w:tc>
-        <w:tc>
-          <w:tcPr>
-            <w:tcW w:type="dxa" w:w="4953"/>
-            <w:tcBorders>
-              <w:top w:val="single" w:color="BFBFBF" w:sz="4"/>
-              <w:left w:val="single" w:color="BFBFBF" w:sz="4"/>
-              <w:bottom w:val="single" w:color="BFBFBF" w:sz="4"/>
-              <w:right w:val="single" w:color="BFBFBF" w:sz="4"/>
-            </w:tcBorders>
-            <w:tcMar>
-              <w:top w:type="dxa" w:w="60"/>
-              <w:left w:type="dxa" w:w="100"/>
-              <w:bottom w:type="dxa" w:w="60"/>
-              <w:right w:type="dxa" w:w="100"/>
-            </w:tcMar>
-          </w:tcPr>
-          <w:p>
-            <w:pPr>
-              <w:spacing w:after="80"/>
-              <w:jc w:val="left"/>
-            </w:pPr>
-            <w:r>
-              <w:rPr>
-                <w:rFonts w:ascii="Arial" w:cs="Arial" w:eastAsia="Arial" w:hAnsi="Arial"/>
-                <w:sz w:val="19"/>
-                <w:szCs w:val="19"/>
-              </w:rPr>
-              <w:t xml:space="preserve">2. OKA SAHALA RAJAGEA SIHOTANG, Warga Negara Indonesia, lahir di Pontianak pada tanggal 4 Desember 1994, pemegang Kartu Tanda Penduduk (KTP) NIK 6171010412940006, alamat sesuai KTP: Jl. M. Sohor Gg. Sederhana No. 34B, RT 004/RW 005, Kel. Akcaya, Kec. Pontianak Selatan, Kota Pontianak, Kalimantan Barat; domisili saat ini di Bali: </w:t>
+              <w:t xml:space="preserve">[________________]</w:t>
+            </w:r>
+            <w:r>
+              <w:rPr>
+                <w:rFonts w:ascii="Arial" w:cs="Arial" w:eastAsia="Arial" w:hAnsi="Arial"/>
+                <w:sz w:val="19"/>
+                <w:szCs w:val="19"/>
+              </w:rPr>
+              <w:t xml:space="preserve">, alamat sesuai KTP: Jl. M. Sohor Gg. Sederhana No. 34B, RT 004/RW 005, Kel. Akcaya, Kec. Pontianak Selatan, Kota Pontianak, Kalimantan Barat; domisili saat ini di Bali: </w:t>
             </w:r>
             <w:r>
               <w:rPr>

</xml_diff>

<commit_message>
PM contract v3: Sales Manager title, duties from job ad, net salary
Co-Authored-By: Claude Opus 5.5 <noreply@anthropic.com>
Claude-Session: https://claude.ai/code/session_019RycNPa9Jvz3V4nJzmzduN
</commit_message>
<xml_diff>
--- a/company/hr/PKWTT-Oka-Sihotang-DRAFT.docx
+++ b/company/hr/PKWTT-Oka-Sihotang-DRAFT.docx
@@ -825,38 +825,38 @@
                 <w:sz w:val="19"/>
                 <w:szCs w:val="19"/>
               </w:rPr>
-              <w:t xml:space="preserve">1.1. The Employee is employed as Project Manager (Sales &amp; Client Projects) and reports directly to the Director of the Company or a person appointed by the Director.</w:t>
-            </w:r>
-          </w:p>
-        </w:tc>
-        <w:tc>
-          <w:tcPr>
-            <w:tcW w:type="dxa" w:w="4953"/>
-            <w:tcBorders>
-              <w:top w:val="single" w:color="BFBFBF" w:sz="4"/>
-              <w:left w:val="single" w:color="BFBFBF" w:sz="4"/>
-              <w:bottom w:val="single" w:color="BFBFBF" w:sz="4"/>
-              <w:right w:val="single" w:color="BFBFBF" w:sz="4"/>
-            </w:tcBorders>
-            <w:tcMar>
-              <w:top w:type="dxa" w:w="60"/>
-              <w:left w:type="dxa" w:w="100"/>
-              <w:bottom w:type="dxa" w:w="60"/>
-              <w:right w:type="dxa" w:w="100"/>
-            </w:tcMar>
-          </w:tcPr>
-          <w:p>
-            <w:pPr>
-              <w:spacing w:after="80"/>
-              <w:jc w:val="left"/>
-            </w:pPr>
-            <w:r>
-              <w:rPr>
-                <w:rFonts w:ascii="Arial" w:cs="Arial" w:eastAsia="Arial" w:hAnsi="Arial"/>
-                <w:sz w:val="19"/>
-                <w:szCs w:val="19"/>
-              </w:rPr>
-              <w:t xml:space="preserve">1.1. Karyawan dipekerjakan sebagai Project Manager (Penjualan &amp; Proyek Klien) dan bertanggung jawab langsung kepada Direktur Perusahaan atau orang yang ditunjuk oleh Direktur.</w:t>
+              <w:t xml:space="preserve">1.1. The Employee is employed as Sales Manager in the Company's villa maintenance business (waterproofing, mold remediation and villa care services) and reports directly to the Director of the Company or a person appointed by the Director.</w:t>
+            </w:r>
+          </w:p>
+        </w:tc>
+        <w:tc>
+          <w:tcPr>
+            <w:tcW w:type="dxa" w:w="4953"/>
+            <w:tcBorders>
+              <w:top w:val="single" w:color="BFBFBF" w:sz="4"/>
+              <w:left w:val="single" w:color="BFBFBF" w:sz="4"/>
+              <w:bottom w:val="single" w:color="BFBFBF" w:sz="4"/>
+              <w:right w:val="single" w:color="BFBFBF" w:sz="4"/>
+            </w:tcBorders>
+            <w:tcMar>
+              <w:top w:type="dxa" w:w="60"/>
+              <w:left w:type="dxa" w:w="100"/>
+              <w:bottom w:type="dxa" w:w="60"/>
+              <w:right w:type="dxa" w:w="100"/>
+            </w:tcMar>
+          </w:tcPr>
+          <w:p>
+            <w:pPr>
+              <w:spacing w:after="80"/>
+              <w:jc w:val="left"/>
+            </w:pPr>
+            <w:r>
+              <w:rPr>
+                <w:rFonts w:ascii="Arial" w:cs="Arial" w:eastAsia="Arial" w:hAnsi="Arial"/>
+                <w:sz w:val="19"/>
+                <w:szCs w:val="19"/>
+              </w:rPr>
+              <w:t xml:space="preserve">1.1. Karyawan dipekerjakan sebagai Sales Manager pada usaha perawatan villa Perusahaan (waterproofing, penanganan jamur dan perawatan villa) dan bertanggung jawab langsung kepada Direktur Perusahaan atau orang yang ditunjuk oleh Direktur.</w:t>
             </w:r>
           </w:p>
         </w:tc>
@@ -1755,7 +1755,74 @@
                 <w:sz w:val="19"/>
                 <w:szCs w:val="19"/>
               </w:rPr>
-              <w:t xml:space="preserve">4.1. During the probation period the Employee receives a fixed monthly salary of IDR 7,000,000 (seven million Rupiah) </w:t>
+              <w:t xml:space="preserve">4.1. During the probation period the Employee receives a fixed monthly salary of IDR 7,000,000 (seven million Rupiah) net (take-home).</w:t>
+            </w:r>
+          </w:p>
+        </w:tc>
+        <w:tc>
+          <w:tcPr>
+            <w:tcW w:type="dxa" w:w="4953"/>
+            <w:tcBorders>
+              <w:top w:val="single" w:color="BFBFBF" w:sz="4"/>
+              <w:left w:val="single" w:color="BFBFBF" w:sz="4"/>
+              <w:bottom w:val="single" w:color="BFBFBF" w:sz="4"/>
+              <w:right w:val="single" w:color="BFBFBF" w:sz="4"/>
+            </w:tcBorders>
+            <w:tcMar>
+              <w:top w:type="dxa" w:w="60"/>
+              <w:left w:type="dxa" w:w="100"/>
+              <w:bottom w:type="dxa" w:w="60"/>
+              <w:right w:type="dxa" w:w="100"/>
+            </w:tcMar>
+          </w:tcPr>
+          <w:p>
+            <w:pPr>
+              <w:spacing w:after="80"/>
+              <w:jc w:val="left"/>
+            </w:pPr>
+            <w:r>
+              <w:rPr>
+                <w:rFonts w:ascii="Arial" w:cs="Arial" w:eastAsia="Arial" w:hAnsi="Arial"/>
+                <w:sz w:val="19"/>
+                <w:szCs w:val="19"/>
+              </w:rPr>
+              <w:t xml:space="preserve">4.1. Selama masa percobaan, Karyawan menerima upah tetap bulanan sebesar Rp 7.000.000 (tujuh juta Rupiah) bersih (take home pay).</w:t>
+            </w:r>
+          </w:p>
+        </w:tc>
+      </w:tr>
+      <w:tr>
+        <w:trPr>
+          <w:cantSplit w:val="false"/>
+        </w:trPr>
+        <w:tc>
+          <w:tcPr>
+            <w:tcW w:type="dxa" w:w="4953"/>
+            <w:tcBorders>
+              <w:top w:val="single" w:color="BFBFBF" w:sz="4"/>
+              <w:left w:val="single" w:color="BFBFBF" w:sz="4"/>
+              <w:bottom w:val="single" w:color="BFBFBF" w:sz="4"/>
+              <w:right w:val="single" w:color="BFBFBF" w:sz="4"/>
+            </w:tcBorders>
+            <w:tcMar>
+              <w:top w:type="dxa" w:w="60"/>
+              <w:left w:type="dxa" w:w="100"/>
+              <w:bottom w:type="dxa" w:w="60"/>
+              <w:right w:type="dxa" w:w="100"/>
+            </w:tcMar>
+          </w:tcPr>
+          <w:p>
+            <w:pPr>
+              <w:spacing w:after="80"/>
+              <w:jc w:val="left"/>
+            </w:pPr>
+            <w:r>
+              <w:rPr>
+                <w:rFonts w:ascii="Arial" w:cs="Arial" w:eastAsia="Arial" w:hAnsi="Arial"/>
+                <w:sz w:val="19"/>
+                <w:szCs w:val="19"/>
+              </w:rPr>
+              <w:t xml:space="preserve">4.2. After successfully passing the probation period the fixed monthly salary is IDR 8,000,000 (eight million Rupiah) </w:t>
             </w:r>
             <w:r>
               <w:rPr>
@@ -1765,7 +1832,7 @@
                 <w:highlight w:val="yellow"/>
                 <w:highlightCs w:val="yellow"/>
               </w:rPr>
-              <w:t xml:space="preserve">[gross]</w:t>
+              <w:t xml:space="preserve">[net (take-home)]</w:t>
             </w:r>
             <w:r>
               <w:rPr>
@@ -1804,7 +1871,7 @@
                 <w:sz w:val="19"/>
                 <w:szCs w:val="19"/>
               </w:rPr>
-              <w:t xml:space="preserve">4.1. Selama masa percobaan, Karyawan menerima upah tetap bulanan sebesar Rp 7.000.000 (tujuh juta Rupiah) </w:t>
+              <w:t xml:space="preserve">4.2. Setelah lulus masa percobaan, upah tetap bulanan menjadi sebesar Rp 8.000.000 (delapan juta Rupiah) </w:t>
             </w:r>
             <w:r>
               <w:rPr>
@@ -1814,7 +1881,7 @@
                 <w:highlight w:val="yellow"/>
                 <w:highlightCs w:val="yellow"/>
               </w:rPr>
-              <w:t xml:space="preserve">[bruto]</w:t>
+              <w:t xml:space="preserve">[bersih (take home pay)]</w:t>
             </w:r>
             <w:r>
               <w:rPr>
@@ -1858,7 +1925,7 @@
                 <w:sz w:val="19"/>
                 <w:szCs w:val="19"/>
               </w:rPr>
-              <w:t xml:space="preserve">4.2. After successfully passing the probation period the fixed monthly salary is IDR 8,000,000 (eight million Rupiah) </w:t>
+              <w:t xml:space="preserve">4.3. The salary is paid monthly, no later than the </w:t>
             </w:r>
             <w:r>
               <w:rPr>
@@ -1868,46 +1935,46 @@
                 <w:highlight w:val="yellow"/>
                 <w:highlightCs w:val="yellow"/>
               </w:rPr>
-              <w:t xml:space="preserve">[gross]</w:t>
-            </w:r>
-            <w:r>
-              <w:rPr>
-                <w:rFonts w:ascii="Arial" w:cs="Arial" w:eastAsia="Arial" w:hAnsi="Arial"/>
-                <w:sz w:val="19"/>
-                <w:szCs w:val="19"/>
-              </w:rPr>
-              <w:t xml:space="preserve">.</w:t>
-            </w:r>
-          </w:p>
-        </w:tc>
-        <w:tc>
-          <w:tcPr>
-            <w:tcW w:type="dxa" w:w="4953"/>
-            <w:tcBorders>
-              <w:top w:val="single" w:color="BFBFBF" w:sz="4"/>
-              <w:left w:val="single" w:color="BFBFBF" w:sz="4"/>
-              <w:bottom w:val="single" w:color="BFBFBF" w:sz="4"/>
-              <w:right w:val="single" w:color="BFBFBF" w:sz="4"/>
-            </w:tcBorders>
-            <w:tcMar>
-              <w:top w:type="dxa" w:w="60"/>
-              <w:left w:type="dxa" w:w="100"/>
-              <w:bottom w:type="dxa" w:w="60"/>
-              <w:right w:type="dxa" w:w="100"/>
-            </w:tcMar>
-          </w:tcPr>
-          <w:p>
-            <w:pPr>
-              <w:spacing w:after="80"/>
-              <w:jc w:val="left"/>
-            </w:pPr>
-            <w:r>
-              <w:rPr>
-                <w:rFonts w:ascii="Arial" w:cs="Arial" w:eastAsia="Arial" w:hAnsi="Arial"/>
-                <w:sz w:val="19"/>
-                <w:szCs w:val="19"/>
-              </w:rPr>
-              <w:t xml:space="preserve">4.2. Setelah lulus masa percobaan, upah tetap bulanan menjadi sebesar Rp 8.000.000 (delapan juta Rupiah) </w:t>
+              <w:t xml:space="preserve">[first working day]</w:t>
+            </w:r>
+            <w:r>
+              <w:rPr>
+                <w:rFonts w:ascii="Arial" w:cs="Arial" w:eastAsia="Arial" w:hAnsi="Arial"/>
+                <w:sz w:val="19"/>
+                <w:szCs w:val="19"/>
+              </w:rPr>
+              <w:t xml:space="preserve"> of the following month, by transfer to the Employee's account: Bank Central Asia (BCA), account no. 0292925288, account holder Oka Sahala Rajagea Sihotang. For an incomplete month, the salary is calculated pro rata to the working days.</w:t>
+            </w:r>
+          </w:p>
+        </w:tc>
+        <w:tc>
+          <w:tcPr>
+            <w:tcW w:type="dxa" w:w="4953"/>
+            <w:tcBorders>
+              <w:top w:val="single" w:color="BFBFBF" w:sz="4"/>
+              <w:left w:val="single" w:color="BFBFBF" w:sz="4"/>
+              <w:bottom w:val="single" w:color="BFBFBF" w:sz="4"/>
+              <w:right w:val="single" w:color="BFBFBF" w:sz="4"/>
+            </w:tcBorders>
+            <w:tcMar>
+              <w:top w:type="dxa" w:w="60"/>
+              <w:left w:type="dxa" w:w="100"/>
+              <w:bottom w:type="dxa" w:w="60"/>
+              <w:right w:type="dxa" w:w="100"/>
+            </w:tcMar>
+          </w:tcPr>
+          <w:p>
+            <w:pPr>
+              <w:spacing w:after="80"/>
+              <w:jc w:val="left"/>
+            </w:pPr>
+            <w:r>
+              <w:rPr>
+                <w:rFonts w:ascii="Arial" w:cs="Arial" w:eastAsia="Arial" w:hAnsi="Arial"/>
+                <w:sz w:val="19"/>
+                <w:szCs w:val="19"/>
+              </w:rPr>
+              <w:t xml:space="preserve">4.3. Upah dibayarkan setiap bulan, paling lambat pada </w:t>
             </w:r>
             <w:r>
               <w:rPr>
@@ -1917,51 +1984,459 @@
                 <w:highlight w:val="yellow"/>
                 <w:highlightCs w:val="yellow"/>
               </w:rPr>
-              <w:t xml:space="preserve">[bruto]</w:t>
-            </w:r>
-            <w:r>
-              <w:rPr>
-                <w:rFonts w:ascii="Arial" w:cs="Arial" w:eastAsia="Arial" w:hAnsi="Arial"/>
-                <w:sz w:val="19"/>
-                <w:szCs w:val="19"/>
-              </w:rPr>
-              <w:t xml:space="preserve">.</w:t>
-            </w:r>
-          </w:p>
-        </w:tc>
-      </w:tr>
-      <w:tr>
-        <w:trPr>
-          <w:cantSplit w:val="false"/>
-        </w:trPr>
-        <w:tc>
-          <w:tcPr>
-            <w:tcW w:type="dxa" w:w="4953"/>
-            <w:tcBorders>
-              <w:top w:val="single" w:color="BFBFBF" w:sz="4"/>
-              <w:left w:val="single" w:color="BFBFBF" w:sz="4"/>
-              <w:bottom w:val="single" w:color="BFBFBF" w:sz="4"/>
-              <w:right w:val="single" w:color="BFBFBF" w:sz="4"/>
-            </w:tcBorders>
-            <w:tcMar>
-              <w:top w:type="dxa" w:w="60"/>
-              <w:left w:type="dxa" w:w="100"/>
-              <w:bottom w:type="dxa" w:w="60"/>
-              <w:right w:type="dxa" w:w="100"/>
-            </w:tcMar>
-          </w:tcPr>
-          <w:p>
-            <w:pPr>
-              <w:spacing w:after="80"/>
-              <w:jc w:val="left"/>
-            </w:pPr>
-            <w:r>
-              <w:rPr>
-                <w:rFonts w:ascii="Arial" w:cs="Arial" w:eastAsia="Arial" w:hAnsi="Arial"/>
-                <w:sz w:val="19"/>
-                <w:szCs w:val="19"/>
-              </w:rPr>
-              <w:t xml:space="preserve">4.3. The salary is paid monthly, no later than the </w:t>
+              <w:t xml:space="preserve">[hari kerja pertama]</w:t>
+            </w:r>
+            <w:r>
+              <w:rPr>
+                <w:rFonts w:ascii="Arial" w:cs="Arial" w:eastAsia="Arial" w:hAnsi="Arial"/>
+                <w:sz w:val="19"/>
+                <w:szCs w:val="19"/>
+              </w:rPr>
+              <w:t xml:space="preserve"> bulan berikutnya, melalui transfer ke rekening Karyawan: Bank Central Asia (BCA), nomor rekening 0292925288, atas nama Oka Sahala Rajagea Sihotang. Untuk bulan yang tidak penuh, upah dihitung secara proporsional sesuai hari kerja.</w:t>
+            </w:r>
+          </w:p>
+        </w:tc>
+      </w:tr>
+      <w:tr>
+        <w:trPr>
+          <w:cantSplit w:val="false"/>
+        </w:trPr>
+        <w:tc>
+          <w:tcPr>
+            <w:tcW w:type="dxa" w:w="4953"/>
+            <w:tcBorders>
+              <w:top w:val="single" w:color="BFBFBF" w:sz="4"/>
+              <w:left w:val="single" w:color="BFBFBF" w:sz="4"/>
+              <w:bottom w:val="single" w:color="BFBFBF" w:sz="4"/>
+              <w:right w:val="single" w:color="BFBFBF" w:sz="4"/>
+            </w:tcBorders>
+            <w:tcMar>
+              <w:top w:type="dxa" w:w="60"/>
+              <w:left w:type="dxa" w:w="100"/>
+              <w:bottom w:type="dxa" w:w="60"/>
+              <w:right w:type="dxa" w:w="100"/>
+            </w:tcMar>
+          </w:tcPr>
+          <w:p>
+            <w:pPr>
+              <w:spacing w:after="80"/>
+              <w:jc w:val="left"/>
+            </w:pPr>
+            <w:r>
+              <w:rPr>
+                <w:rFonts w:ascii="Arial" w:cs="Arial" w:eastAsia="Arial" w:hAnsi="Arial"/>
+                <w:sz w:val="19"/>
+                <w:szCs w:val="19"/>
+              </w:rPr>
+              <w:t xml:space="preserve">4.4. The salary amounts in Articles 4.1 and 4.2 are net. Income tax (PPh 21) and the Employee's share of BPJS contributions on these amounts are borne and paid by the Company in accordance with the law.</w:t>
+            </w:r>
+          </w:p>
+        </w:tc>
+        <w:tc>
+          <w:tcPr>
+            <w:tcW w:type="dxa" w:w="4953"/>
+            <w:tcBorders>
+              <w:top w:val="single" w:color="BFBFBF" w:sz="4"/>
+              <w:left w:val="single" w:color="BFBFBF" w:sz="4"/>
+              <w:bottom w:val="single" w:color="BFBFBF" w:sz="4"/>
+              <w:right w:val="single" w:color="BFBFBF" w:sz="4"/>
+            </w:tcBorders>
+            <w:tcMar>
+              <w:top w:type="dxa" w:w="60"/>
+              <w:left w:type="dxa" w:w="100"/>
+              <w:bottom w:type="dxa" w:w="60"/>
+              <w:right w:type="dxa" w:w="100"/>
+            </w:tcMar>
+          </w:tcPr>
+          <w:p>
+            <w:pPr>
+              <w:spacing w:after="80"/>
+              <w:jc w:val="left"/>
+            </w:pPr>
+            <w:r>
+              <w:rPr>
+                <w:rFonts w:ascii="Arial" w:cs="Arial" w:eastAsia="Arial" w:hAnsi="Arial"/>
+                <w:sz w:val="19"/>
+                <w:szCs w:val="19"/>
+              </w:rPr>
+              <w:t xml:space="preserve">4.4. Jumlah upah dalam Pasal 4.1 dan 4.2 merupakan upah bersih. Pajak penghasilan (PPh 21) dan bagian iuran BPJS Karyawan atas jumlah tersebut ditanggung dan dibayar oleh Perusahaan sesuai dengan peraturan perundang-undangan.</w:t>
+            </w:r>
+          </w:p>
+        </w:tc>
+      </w:tr>
+      <w:tr>
+        <w:trPr>
+          <w:cantSplit w:val="false"/>
+        </w:trPr>
+        <w:tc>
+          <w:tcPr>
+            <w:tcW w:type="dxa" w:w="4953"/>
+            <w:tcBorders>
+              <w:top w:val="single" w:color="BFBFBF" w:sz="4"/>
+              <w:left w:val="single" w:color="BFBFBF" w:sz="4"/>
+              <w:bottom w:val="single" w:color="BFBFBF" w:sz="4"/>
+              <w:right w:val="single" w:color="BFBFBF" w:sz="4"/>
+            </w:tcBorders>
+            <w:tcMar>
+              <w:top w:type="dxa" w:w="60"/>
+              <w:left w:type="dxa" w:w="100"/>
+              <w:bottom w:type="dxa" w:w="60"/>
+              <w:right w:type="dxa" w:w="100"/>
+            </w:tcMar>
+          </w:tcPr>
+          <w:p>
+            <w:pPr>
+              <w:spacing w:after="80"/>
+              <w:jc w:val="left"/>
+            </w:pPr>
+            <w:r>
+              <w:rPr>
+                <w:rFonts w:ascii="Arial" w:cs="Arial" w:eastAsia="Arial" w:hAnsi="Arial"/>
+                <w:sz w:val="19"/>
+                <w:szCs w:val="19"/>
+              </w:rPr>
+              <w:t xml:space="preserve">4.5. Bonuses and sales commissions are governed by a separate written agreement between the Parties and are not part of the fixed salary.</w:t>
+            </w:r>
+          </w:p>
+        </w:tc>
+        <w:tc>
+          <w:tcPr>
+            <w:tcW w:type="dxa" w:w="4953"/>
+            <w:tcBorders>
+              <w:top w:val="single" w:color="BFBFBF" w:sz="4"/>
+              <w:left w:val="single" w:color="BFBFBF" w:sz="4"/>
+              <w:bottom w:val="single" w:color="BFBFBF" w:sz="4"/>
+              <w:right w:val="single" w:color="BFBFBF" w:sz="4"/>
+            </w:tcBorders>
+            <w:tcMar>
+              <w:top w:type="dxa" w:w="60"/>
+              <w:left w:type="dxa" w:w="100"/>
+              <w:bottom w:type="dxa" w:w="60"/>
+              <w:right w:type="dxa" w:w="100"/>
+            </w:tcMar>
+          </w:tcPr>
+          <w:p>
+            <w:pPr>
+              <w:spacing w:after="80"/>
+              <w:jc w:val="left"/>
+            </w:pPr>
+            <w:r>
+              <w:rPr>
+                <w:rFonts w:ascii="Arial" w:cs="Arial" w:eastAsia="Arial" w:hAnsi="Arial"/>
+                <w:sz w:val="19"/>
+                <w:szCs w:val="19"/>
+              </w:rPr>
+              <w:t xml:space="preserve">4.5. Bonus dan komisi penjualan diatur dalam perjanjian tertulis tersendiri antara Para Pihak dan bukan merupakan bagian dari upah tetap.</w:t>
+            </w:r>
+          </w:p>
+        </w:tc>
+      </w:tr>
+      <w:tr>
+        <w:trPr>
+          <w:cantSplit w:val="false"/>
+        </w:trPr>
+        <w:tc>
+          <w:tcPr>
+            <w:tcW w:type="dxa" w:w="4953"/>
+            <w:tcBorders>
+              <w:top w:val="single" w:color="BFBFBF" w:sz="4"/>
+              <w:left w:val="single" w:color="BFBFBF" w:sz="4"/>
+              <w:bottom w:val="single" w:color="BFBFBF" w:sz="4"/>
+              <w:right w:val="single" w:color="BFBFBF" w:sz="4"/>
+            </w:tcBorders>
+            <w:tcMar>
+              <w:top w:type="dxa" w:w="60"/>
+              <w:left w:type="dxa" w:w="100"/>
+              <w:bottom w:type="dxa" w:w="60"/>
+              <w:right w:type="dxa" w:w="100"/>
+            </w:tcMar>
+          </w:tcPr>
+          <w:p>
+            <w:pPr>
+              <w:spacing w:after="80"/>
+              <w:jc w:val="left"/>
+            </w:pPr>
+            <w:r>
+              <w:rPr>
+                <w:rFonts w:ascii="Arial" w:cs="Arial" w:eastAsia="Arial" w:hAnsi="Arial"/>
+                <w:sz w:val="19"/>
+                <w:szCs w:val="19"/>
+              </w:rPr>
+              <w:t xml:space="preserve">4.6. The Employee is entitled to a religious holiday allowance (THR) in accordance with the law.</w:t>
+            </w:r>
+          </w:p>
+        </w:tc>
+        <w:tc>
+          <w:tcPr>
+            <w:tcW w:type="dxa" w:w="4953"/>
+            <w:tcBorders>
+              <w:top w:val="single" w:color="BFBFBF" w:sz="4"/>
+              <w:left w:val="single" w:color="BFBFBF" w:sz="4"/>
+              <w:bottom w:val="single" w:color="BFBFBF" w:sz="4"/>
+              <w:right w:val="single" w:color="BFBFBF" w:sz="4"/>
+            </w:tcBorders>
+            <w:tcMar>
+              <w:top w:type="dxa" w:w="60"/>
+              <w:left w:type="dxa" w:w="100"/>
+              <w:bottom w:type="dxa" w:w="60"/>
+              <w:right w:type="dxa" w:w="100"/>
+            </w:tcMar>
+          </w:tcPr>
+          <w:p>
+            <w:pPr>
+              <w:spacing w:after="80"/>
+              <w:jc w:val="left"/>
+            </w:pPr>
+            <w:r>
+              <w:rPr>
+                <w:rFonts w:ascii="Arial" w:cs="Arial" w:eastAsia="Arial" w:hAnsi="Arial"/>
+                <w:sz w:val="19"/>
+                <w:szCs w:val="19"/>
+              </w:rPr>
+              <w:t xml:space="preserve">4.6. Karyawan berhak atas Tunjangan Hari Raya Keagamaan (THR) sesuai dengan peraturan perundang-undangan.</w:t>
+            </w:r>
+          </w:p>
+        </w:tc>
+      </w:tr>
+      <w:tr>
+        <w:trPr>
+          <w:cantSplit w:val="false"/>
+        </w:trPr>
+        <w:tc>
+          <w:tcPr>
+            <w:tcW w:type="dxa" w:w="4953"/>
+            <w:tcBorders>
+              <w:top w:val="single" w:color="BFBFBF" w:sz="4"/>
+              <w:left w:val="single" w:color="BFBFBF" w:sz="4"/>
+              <w:bottom w:val="single" w:color="BFBFBF" w:sz="4"/>
+              <w:right w:val="single" w:color="BFBFBF" w:sz="4"/>
+            </w:tcBorders>
+            <w:shd w:fill="EAF1F8" w:color="auto" w:val="clear"/>
+            <w:tcMar>
+              <w:top w:type="dxa" w:w="60"/>
+              <w:left w:type="dxa" w:w="100"/>
+              <w:bottom w:type="dxa" w:w="60"/>
+              <w:right w:type="dxa" w:w="100"/>
+            </w:tcMar>
+          </w:tcPr>
+          <w:p>
+            <w:pPr>
+              <w:spacing w:after="80"/>
+              <w:jc w:val="left"/>
+            </w:pPr>
+            <w:r>
+              <w:rPr>
+                <w:rFonts w:ascii="Arial" w:cs="Arial" w:eastAsia="Arial" w:hAnsi="Arial"/>
+                <w:b/>
+                <w:bCs/>
+                <w:sz w:val="19"/>
+                <w:szCs w:val="19"/>
+              </w:rPr>
+              <w:t xml:space="preserve">ARTICLE 5 — VEHICLE AND WORK EXPENSES</w:t>
+            </w:r>
+          </w:p>
+        </w:tc>
+        <w:tc>
+          <w:tcPr>
+            <w:tcW w:type="dxa" w:w="4953"/>
+            <w:tcBorders>
+              <w:top w:val="single" w:color="BFBFBF" w:sz="4"/>
+              <w:left w:val="single" w:color="BFBFBF" w:sz="4"/>
+              <w:bottom w:val="single" w:color="BFBFBF" w:sz="4"/>
+              <w:right w:val="single" w:color="BFBFBF" w:sz="4"/>
+            </w:tcBorders>
+            <w:shd w:fill="EAF1F8" w:color="auto" w:val="clear"/>
+            <w:tcMar>
+              <w:top w:type="dxa" w:w="60"/>
+              <w:left w:type="dxa" w:w="100"/>
+              <w:bottom w:type="dxa" w:w="60"/>
+              <w:right w:type="dxa" w:w="100"/>
+            </w:tcMar>
+          </w:tcPr>
+          <w:p>
+            <w:pPr>
+              <w:spacing w:after="80"/>
+              <w:jc w:val="left"/>
+            </w:pPr>
+            <w:r>
+              <w:rPr>
+                <w:rFonts w:ascii="Arial" w:cs="Arial" w:eastAsia="Arial" w:hAnsi="Arial"/>
+                <w:b/>
+                <w:bCs/>
+                <w:sz w:val="19"/>
+                <w:szCs w:val="19"/>
+              </w:rPr>
+              <w:t xml:space="preserve">PASAL 5 — KENDARAAN DAN BIAYA KERJA</w:t>
+            </w:r>
+          </w:p>
+        </w:tc>
+      </w:tr>
+      <w:tr>
+        <w:trPr>
+          <w:cantSplit w:val="false"/>
+        </w:trPr>
+        <w:tc>
+          <w:tcPr>
+            <w:tcW w:type="dxa" w:w="4953"/>
+            <w:tcBorders>
+              <w:top w:val="single" w:color="BFBFBF" w:sz="4"/>
+              <w:left w:val="single" w:color="BFBFBF" w:sz="4"/>
+              <w:bottom w:val="single" w:color="BFBFBF" w:sz="4"/>
+              <w:right w:val="single" w:color="BFBFBF" w:sz="4"/>
+            </w:tcBorders>
+            <w:tcMar>
+              <w:top w:type="dxa" w:w="60"/>
+              <w:left w:type="dxa" w:w="100"/>
+              <w:bottom w:type="dxa" w:w="60"/>
+              <w:right w:type="dxa" w:w="100"/>
+            </w:tcMar>
+          </w:tcPr>
+          <w:p>
+            <w:pPr>
+              <w:spacing w:after="80"/>
+              <w:jc w:val="left"/>
+            </w:pPr>
+            <w:r>
+              <w:rPr>
+                <w:rFonts w:ascii="Arial" w:cs="Arial" w:eastAsia="Arial" w:hAnsi="Arial"/>
+                <w:sz w:val="19"/>
+                <w:szCs w:val="19"/>
+              </w:rPr>
+              <w:t xml:space="preserve">5.1. The Employee performs work-related trips using his own motorbike or car and shall hold a valid driving license (SIM) and vehicle registration (STNK) at all times.</w:t>
+            </w:r>
+          </w:p>
+        </w:tc>
+        <w:tc>
+          <w:tcPr>
+            <w:tcW w:type="dxa" w:w="4953"/>
+            <w:tcBorders>
+              <w:top w:val="single" w:color="BFBFBF" w:sz="4"/>
+              <w:left w:val="single" w:color="BFBFBF" w:sz="4"/>
+              <w:bottom w:val="single" w:color="BFBFBF" w:sz="4"/>
+              <w:right w:val="single" w:color="BFBFBF" w:sz="4"/>
+            </w:tcBorders>
+            <w:tcMar>
+              <w:top w:type="dxa" w:w="60"/>
+              <w:left w:type="dxa" w:w="100"/>
+              <w:bottom w:type="dxa" w:w="60"/>
+              <w:right w:type="dxa" w:w="100"/>
+            </w:tcMar>
+          </w:tcPr>
+          <w:p>
+            <w:pPr>
+              <w:spacing w:after="80"/>
+              <w:jc w:val="left"/>
+            </w:pPr>
+            <w:r>
+              <w:rPr>
+                <w:rFonts w:ascii="Arial" w:cs="Arial" w:eastAsia="Arial" w:hAnsi="Arial"/>
+                <w:sz w:val="19"/>
+                <w:szCs w:val="19"/>
+              </w:rPr>
+              <w:t xml:space="preserve">5.1. Karyawan melakukan perjalanan dinas menggunakan sepeda motor atau mobil miliknya sendiri dan wajib selalu memiliki Surat Izin Mengemudi (SIM) dan Surat Tanda Nomor Kendaraan (STNK) yang berlaku.</w:t>
+            </w:r>
+          </w:p>
+        </w:tc>
+      </w:tr>
+      <w:tr>
+        <w:trPr>
+          <w:cantSplit w:val="false"/>
+        </w:trPr>
+        <w:tc>
+          <w:tcPr>
+            <w:tcW w:type="dxa" w:w="4953"/>
+            <w:tcBorders>
+              <w:top w:val="single" w:color="BFBFBF" w:sz="4"/>
+              <w:left w:val="single" w:color="BFBFBF" w:sz="4"/>
+              <w:bottom w:val="single" w:color="BFBFBF" w:sz="4"/>
+              <w:right w:val="single" w:color="BFBFBF" w:sz="4"/>
+            </w:tcBorders>
+            <w:tcMar>
+              <w:top w:type="dxa" w:w="60"/>
+              <w:left w:type="dxa" w:w="100"/>
+              <w:bottom w:type="dxa" w:w="60"/>
+              <w:right w:type="dxa" w:w="100"/>
+            </w:tcMar>
+          </w:tcPr>
+          <w:p>
+            <w:pPr>
+              <w:spacing w:after="80"/>
+              <w:jc w:val="left"/>
+            </w:pPr>
+            <w:r>
+              <w:rPr>
+                <w:rFonts w:ascii="Arial" w:cs="Arial" w:eastAsia="Arial" w:hAnsi="Arial"/>
+                <w:sz w:val="19"/>
+                <w:szCs w:val="19"/>
+              </w:rPr>
+              <w:t xml:space="preserve">5.2. Maintenance, repair and insurance of the vehicle, as well as traffic fines, are at the Employee's own expense.</w:t>
+            </w:r>
+          </w:p>
+        </w:tc>
+        <w:tc>
+          <w:tcPr>
+            <w:tcW w:type="dxa" w:w="4953"/>
+            <w:tcBorders>
+              <w:top w:val="single" w:color="BFBFBF" w:sz="4"/>
+              <w:left w:val="single" w:color="BFBFBF" w:sz="4"/>
+              <w:bottom w:val="single" w:color="BFBFBF" w:sz="4"/>
+              <w:right w:val="single" w:color="BFBFBF" w:sz="4"/>
+            </w:tcBorders>
+            <w:tcMar>
+              <w:top w:type="dxa" w:w="60"/>
+              <w:left w:type="dxa" w:w="100"/>
+              <w:bottom w:type="dxa" w:w="60"/>
+              <w:right w:type="dxa" w:w="100"/>
+            </w:tcMar>
+          </w:tcPr>
+          <w:p>
+            <w:pPr>
+              <w:spacing w:after="80"/>
+              <w:jc w:val="left"/>
+            </w:pPr>
+            <w:r>
+              <w:rPr>
+                <w:rFonts w:ascii="Arial" w:cs="Arial" w:eastAsia="Arial" w:hAnsi="Arial"/>
+                <w:sz w:val="19"/>
+                <w:szCs w:val="19"/>
+              </w:rPr>
+              <w:t xml:space="preserve">5.2. Biaya perawatan, perbaikan dan asuransi kendaraan, serta denda lalu lintas, menjadi tanggungan Karyawan sendiri.</w:t>
+            </w:r>
+          </w:p>
+        </w:tc>
+      </w:tr>
+      <w:tr>
+        <w:trPr>
+          <w:cantSplit w:val="false"/>
+        </w:trPr>
+        <w:tc>
+          <w:tcPr>
+            <w:tcW w:type="dxa" w:w="4953"/>
+            <w:tcBorders>
+              <w:top w:val="single" w:color="BFBFBF" w:sz="4"/>
+              <w:left w:val="single" w:color="BFBFBF" w:sz="4"/>
+              <w:bottom w:val="single" w:color="BFBFBF" w:sz="4"/>
+              <w:right w:val="single" w:color="BFBFBF" w:sz="4"/>
+            </w:tcBorders>
+            <w:tcMar>
+              <w:top w:type="dxa" w:w="60"/>
+              <w:left w:type="dxa" w:w="100"/>
+              <w:bottom w:type="dxa" w:w="60"/>
+              <w:right w:type="dxa" w:w="100"/>
+            </w:tcMar>
+          </w:tcPr>
+          <w:p>
+            <w:pPr>
+              <w:spacing w:after="80"/>
+              <w:jc w:val="left"/>
+            </w:pPr>
+            <w:r>
+              <w:rPr>
+                <w:rFonts w:ascii="Arial" w:cs="Arial" w:eastAsia="Arial" w:hAnsi="Arial"/>
+                <w:sz w:val="19"/>
+                <w:szCs w:val="19"/>
+              </w:rPr>
+              <w:t xml:space="preserve">5.3. Fuel for work-related trips is reimbursed by the Company weekly, every Monday, for trips made during the preceding Monday–Sunday period, based on the visit log submitted by the Employee. </w:t>
             </w:r>
             <w:r>
               <w:rPr>
@@ -1971,46 +2446,38 @@
                 <w:highlight w:val="yellow"/>
                 <w:highlightCs w:val="yellow"/>
               </w:rPr>
-              <w:t xml:space="preserve">[first working day]</w:t>
-            </w:r>
-            <w:r>
-              <w:rPr>
-                <w:rFonts w:ascii="Arial" w:cs="Arial" w:eastAsia="Arial" w:hAnsi="Arial"/>
-                <w:sz w:val="19"/>
-                <w:szCs w:val="19"/>
-              </w:rPr>
-              <w:t xml:space="preserve"> of the following month, by transfer to the Employee's account: Bank Central Asia (BCA), account no. 0292925288, account holder Oka Sahala Rajagea Sihotang. For an incomplete month, the salary is calculated pro rata to the working days.</w:t>
-            </w:r>
-          </w:p>
-        </w:tc>
-        <w:tc>
-          <w:tcPr>
-            <w:tcW w:type="dxa" w:w="4953"/>
-            <w:tcBorders>
-              <w:top w:val="single" w:color="BFBFBF" w:sz="4"/>
-              <w:left w:val="single" w:color="BFBFBF" w:sz="4"/>
-              <w:bottom w:val="single" w:color="BFBFBF" w:sz="4"/>
-              <w:right w:val="single" w:color="BFBFBF" w:sz="4"/>
-            </w:tcBorders>
-            <w:tcMar>
-              <w:top w:type="dxa" w:w="60"/>
-              <w:left w:type="dxa" w:w="100"/>
-              <w:bottom w:type="dxa" w:w="60"/>
-              <w:right w:type="dxa" w:w="100"/>
-            </w:tcMar>
-          </w:tcPr>
-          <w:p>
-            <w:pPr>
-              <w:spacing w:after="80"/>
-              <w:jc w:val="left"/>
-            </w:pPr>
-            <w:r>
-              <w:rPr>
-                <w:rFonts w:ascii="Arial" w:cs="Arial" w:eastAsia="Arial" w:hAnsi="Arial"/>
-                <w:sz w:val="19"/>
-                <w:szCs w:val="19"/>
-              </w:rPr>
-              <w:t xml:space="preserve">4.3. Upah dibayarkan setiap bulan, paling lambat pada </w:t>
+              <w:t xml:space="preserve">[Alternative: a fixed transport allowance of IDR ________ per month.]</w:t>
+            </w:r>
+          </w:p>
+        </w:tc>
+        <w:tc>
+          <w:tcPr>
+            <w:tcW w:type="dxa" w:w="4953"/>
+            <w:tcBorders>
+              <w:top w:val="single" w:color="BFBFBF" w:sz="4"/>
+              <w:left w:val="single" w:color="BFBFBF" w:sz="4"/>
+              <w:bottom w:val="single" w:color="BFBFBF" w:sz="4"/>
+              <w:right w:val="single" w:color="BFBFBF" w:sz="4"/>
+            </w:tcBorders>
+            <w:tcMar>
+              <w:top w:type="dxa" w:w="60"/>
+              <w:left w:type="dxa" w:w="100"/>
+              <w:bottom w:type="dxa" w:w="60"/>
+              <w:right w:type="dxa" w:w="100"/>
+            </w:tcMar>
+          </w:tcPr>
+          <w:p>
+            <w:pPr>
+              <w:spacing w:after="80"/>
+              <w:jc w:val="left"/>
+            </w:pPr>
+            <w:r>
+              <w:rPr>
+                <w:rFonts w:ascii="Arial" w:cs="Arial" w:eastAsia="Arial" w:hAnsi="Arial"/>
+                <w:sz w:val="19"/>
+                <w:szCs w:val="19"/>
+              </w:rPr>
+              <w:t xml:space="preserve">5.3. Biaya bahan bakar untuk perjalanan dinas diganti oleh Perusahaan setiap minggu, pada hari Senin, untuk perjalanan periode Senin–Minggu sebelumnya, berdasarkan catatan kunjungan yang diserahkan Karyawan. </w:t>
             </w:r>
             <w:r>
               <w:rPr>
@@ -2020,216 +2487,74 @@
                 <w:highlight w:val="yellow"/>
                 <w:highlightCs w:val="yellow"/>
               </w:rPr>
-              <w:t xml:space="preserve">[hari kerja pertama]</w:t>
-            </w:r>
-            <w:r>
-              <w:rPr>
-                <w:rFonts w:ascii="Arial" w:cs="Arial" w:eastAsia="Arial" w:hAnsi="Arial"/>
-                <w:sz w:val="19"/>
-                <w:szCs w:val="19"/>
-              </w:rPr>
-              <w:t xml:space="preserve"> bulan berikutnya, melalui transfer ke rekening Karyawan: Bank Central Asia (BCA), nomor rekening 0292925288, atas nama Oka Sahala Rajagea Sihotang. Untuk bulan yang tidak penuh, upah dihitung secara proporsional sesuai hari kerja.</w:t>
-            </w:r>
-          </w:p>
-        </w:tc>
-      </w:tr>
-      <w:tr>
-        <w:trPr>
-          <w:cantSplit w:val="false"/>
-        </w:trPr>
-        <w:tc>
-          <w:tcPr>
-            <w:tcW w:type="dxa" w:w="4953"/>
-            <w:tcBorders>
-              <w:top w:val="single" w:color="BFBFBF" w:sz="4"/>
-              <w:left w:val="single" w:color="BFBFBF" w:sz="4"/>
-              <w:bottom w:val="single" w:color="BFBFBF" w:sz="4"/>
-              <w:right w:val="single" w:color="BFBFBF" w:sz="4"/>
-            </w:tcBorders>
-            <w:tcMar>
-              <w:top w:type="dxa" w:w="60"/>
-              <w:left w:type="dxa" w:w="100"/>
-              <w:bottom w:type="dxa" w:w="60"/>
-              <w:right w:type="dxa" w:w="100"/>
-            </w:tcMar>
-          </w:tcPr>
-          <w:p>
-            <w:pPr>
-              <w:spacing w:after="80"/>
-              <w:jc w:val="left"/>
-            </w:pPr>
-            <w:r>
-              <w:rPr>
-                <w:rFonts w:ascii="Arial" w:cs="Arial" w:eastAsia="Arial" w:hAnsi="Arial"/>
-                <w:sz w:val="19"/>
-                <w:szCs w:val="19"/>
-              </w:rPr>
-              <w:t xml:space="preserve">4.4. Income tax (PPh 21) is calculated and withheld by the Company in accordance with the tax laws.</w:t>
-            </w:r>
-          </w:p>
-        </w:tc>
-        <w:tc>
-          <w:tcPr>
-            <w:tcW w:type="dxa" w:w="4953"/>
-            <w:tcBorders>
-              <w:top w:val="single" w:color="BFBFBF" w:sz="4"/>
-              <w:left w:val="single" w:color="BFBFBF" w:sz="4"/>
-              <w:bottom w:val="single" w:color="BFBFBF" w:sz="4"/>
-              <w:right w:val="single" w:color="BFBFBF" w:sz="4"/>
-            </w:tcBorders>
-            <w:tcMar>
-              <w:top w:type="dxa" w:w="60"/>
-              <w:left w:type="dxa" w:w="100"/>
-              <w:bottom w:type="dxa" w:w="60"/>
-              <w:right w:type="dxa" w:w="100"/>
-            </w:tcMar>
-          </w:tcPr>
-          <w:p>
-            <w:pPr>
-              <w:spacing w:after="80"/>
-              <w:jc w:val="left"/>
-            </w:pPr>
-            <w:r>
-              <w:rPr>
-                <w:rFonts w:ascii="Arial" w:cs="Arial" w:eastAsia="Arial" w:hAnsi="Arial"/>
-                <w:sz w:val="19"/>
-                <w:szCs w:val="19"/>
-              </w:rPr>
-              <w:t xml:space="preserve">4.4. Pajak penghasilan (PPh 21) dihitung dan dipotong oleh Perusahaan sesuai dengan peraturan perpajakan.</w:t>
-            </w:r>
-          </w:p>
-        </w:tc>
-      </w:tr>
-      <w:tr>
-        <w:trPr>
-          <w:cantSplit w:val="false"/>
-        </w:trPr>
-        <w:tc>
-          <w:tcPr>
-            <w:tcW w:type="dxa" w:w="4953"/>
-            <w:tcBorders>
-              <w:top w:val="single" w:color="BFBFBF" w:sz="4"/>
-              <w:left w:val="single" w:color="BFBFBF" w:sz="4"/>
-              <w:bottom w:val="single" w:color="BFBFBF" w:sz="4"/>
-              <w:right w:val="single" w:color="BFBFBF" w:sz="4"/>
-            </w:tcBorders>
-            <w:tcMar>
-              <w:top w:type="dxa" w:w="60"/>
-              <w:left w:type="dxa" w:w="100"/>
-              <w:bottom w:type="dxa" w:w="60"/>
-              <w:right w:type="dxa" w:w="100"/>
-            </w:tcMar>
-          </w:tcPr>
-          <w:p>
-            <w:pPr>
-              <w:spacing w:after="80"/>
-              <w:jc w:val="left"/>
-            </w:pPr>
-            <w:r>
-              <w:rPr>
-                <w:rFonts w:ascii="Arial" w:cs="Arial" w:eastAsia="Arial" w:hAnsi="Arial"/>
-                <w:sz w:val="19"/>
-                <w:szCs w:val="19"/>
-              </w:rPr>
-              <w:t xml:space="preserve">4.5. Bonuses and sales commissions are governed by a separate written agreement between the Parties and are not part of the fixed salary.</w:t>
-            </w:r>
-          </w:p>
-        </w:tc>
-        <w:tc>
-          <w:tcPr>
-            <w:tcW w:type="dxa" w:w="4953"/>
-            <w:tcBorders>
-              <w:top w:val="single" w:color="BFBFBF" w:sz="4"/>
-              <w:left w:val="single" w:color="BFBFBF" w:sz="4"/>
-              <w:bottom w:val="single" w:color="BFBFBF" w:sz="4"/>
-              <w:right w:val="single" w:color="BFBFBF" w:sz="4"/>
-            </w:tcBorders>
-            <w:tcMar>
-              <w:top w:type="dxa" w:w="60"/>
-              <w:left w:type="dxa" w:w="100"/>
-              <w:bottom w:type="dxa" w:w="60"/>
-              <w:right w:type="dxa" w:w="100"/>
-            </w:tcMar>
-          </w:tcPr>
-          <w:p>
-            <w:pPr>
-              <w:spacing w:after="80"/>
-              <w:jc w:val="left"/>
-            </w:pPr>
-            <w:r>
-              <w:rPr>
-                <w:rFonts w:ascii="Arial" w:cs="Arial" w:eastAsia="Arial" w:hAnsi="Arial"/>
-                <w:sz w:val="19"/>
-                <w:szCs w:val="19"/>
-              </w:rPr>
-              <w:t xml:space="preserve">4.5. Bonus dan komisi penjualan diatur dalam perjanjian tertulis tersendiri antara Para Pihak dan bukan merupakan bagian dari upah tetap.</w:t>
-            </w:r>
-          </w:p>
-        </w:tc>
-      </w:tr>
-      <w:tr>
-        <w:trPr>
-          <w:cantSplit w:val="false"/>
-        </w:trPr>
-        <w:tc>
-          <w:tcPr>
-            <w:tcW w:type="dxa" w:w="4953"/>
-            <w:tcBorders>
-              <w:top w:val="single" w:color="BFBFBF" w:sz="4"/>
-              <w:left w:val="single" w:color="BFBFBF" w:sz="4"/>
-              <w:bottom w:val="single" w:color="BFBFBF" w:sz="4"/>
-              <w:right w:val="single" w:color="BFBFBF" w:sz="4"/>
-            </w:tcBorders>
-            <w:tcMar>
-              <w:top w:type="dxa" w:w="60"/>
-              <w:left w:type="dxa" w:w="100"/>
-              <w:bottom w:type="dxa" w:w="60"/>
-              <w:right w:type="dxa" w:w="100"/>
-            </w:tcMar>
-          </w:tcPr>
-          <w:p>
-            <w:pPr>
-              <w:spacing w:after="80"/>
-              <w:jc w:val="left"/>
-            </w:pPr>
-            <w:r>
-              <w:rPr>
-                <w:rFonts w:ascii="Arial" w:cs="Arial" w:eastAsia="Arial" w:hAnsi="Arial"/>
-                <w:sz w:val="19"/>
-                <w:szCs w:val="19"/>
-              </w:rPr>
-              <w:t xml:space="preserve">4.6. The Employee is entitled to a religious holiday allowance (THR) in accordance with the law.</w:t>
-            </w:r>
-          </w:p>
-        </w:tc>
-        <w:tc>
-          <w:tcPr>
-            <w:tcW w:type="dxa" w:w="4953"/>
-            <w:tcBorders>
-              <w:top w:val="single" w:color="BFBFBF" w:sz="4"/>
-              <w:left w:val="single" w:color="BFBFBF" w:sz="4"/>
-              <w:bottom w:val="single" w:color="BFBFBF" w:sz="4"/>
-              <w:right w:val="single" w:color="BFBFBF" w:sz="4"/>
-            </w:tcBorders>
-            <w:tcMar>
-              <w:top w:type="dxa" w:w="60"/>
-              <w:left w:type="dxa" w:w="100"/>
-              <w:bottom w:type="dxa" w:w="60"/>
-              <w:right w:type="dxa" w:w="100"/>
-            </w:tcMar>
-          </w:tcPr>
-          <w:p>
-            <w:pPr>
-              <w:spacing w:after="80"/>
-              <w:jc w:val="left"/>
-            </w:pPr>
-            <w:r>
-              <w:rPr>
-                <w:rFonts w:ascii="Arial" w:cs="Arial" w:eastAsia="Arial" w:hAnsi="Arial"/>
-                <w:sz w:val="19"/>
-                <w:szCs w:val="19"/>
-              </w:rPr>
-              <w:t xml:space="preserve">4.6. Karyawan berhak atas Tunjangan Hari Raya Keagamaan (THR) sesuai dengan peraturan perundang-undangan.</w:t>
+              <w:t xml:space="preserve">[Alternatif: tunjangan transportasi tetap sebesar Rp ________ per bulan.]</w:t>
+            </w:r>
+          </w:p>
+        </w:tc>
+      </w:tr>
+      <w:tr>
+        <w:trPr>
+          <w:cantSplit w:val="false"/>
+        </w:trPr>
+        <w:tc>
+          <w:tcPr>
+            <w:tcW w:type="dxa" w:w="4953"/>
+            <w:tcBorders>
+              <w:top w:val="single" w:color="BFBFBF" w:sz="4"/>
+              <w:left w:val="single" w:color="BFBFBF" w:sz="4"/>
+              <w:bottom w:val="single" w:color="BFBFBF" w:sz="4"/>
+              <w:right w:val="single" w:color="BFBFBF" w:sz="4"/>
+            </w:tcBorders>
+            <w:tcMar>
+              <w:top w:type="dxa" w:w="60"/>
+              <w:left w:type="dxa" w:w="100"/>
+              <w:bottom w:type="dxa" w:w="60"/>
+              <w:right w:type="dxa" w:w="100"/>
+            </w:tcMar>
+          </w:tcPr>
+          <w:p>
+            <w:pPr>
+              <w:spacing w:after="80"/>
+              <w:jc w:val="left"/>
+            </w:pPr>
+            <w:r>
+              <w:rPr>
+                <w:rFonts w:ascii="Arial" w:cs="Arial" w:eastAsia="Arial" w:hAnsi="Arial"/>
+                <w:sz w:val="19"/>
+                <w:szCs w:val="19"/>
+              </w:rPr>
+              <w:t xml:space="preserve">5.4. Parking and other pre-approved work expenses are reimbursed against receipts.</w:t>
+            </w:r>
+          </w:p>
+        </w:tc>
+        <w:tc>
+          <w:tcPr>
+            <w:tcW w:type="dxa" w:w="4953"/>
+            <w:tcBorders>
+              <w:top w:val="single" w:color="BFBFBF" w:sz="4"/>
+              <w:left w:val="single" w:color="BFBFBF" w:sz="4"/>
+              <w:bottom w:val="single" w:color="BFBFBF" w:sz="4"/>
+              <w:right w:val="single" w:color="BFBFBF" w:sz="4"/>
+            </w:tcBorders>
+            <w:tcMar>
+              <w:top w:type="dxa" w:w="60"/>
+              <w:left w:type="dxa" w:w="100"/>
+              <w:bottom w:type="dxa" w:w="60"/>
+              <w:right w:type="dxa" w:w="100"/>
+            </w:tcMar>
+          </w:tcPr>
+          <w:p>
+            <w:pPr>
+              <w:spacing w:after="80"/>
+              <w:jc w:val="left"/>
+            </w:pPr>
+            <w:r>
+              <w:rPr>
+                <w:rFonts w:ascii="Arial" w:cs="Arial" w:eastAsia="Arial" w:hAnsi="Arial"/>
+                <w:sz w:val="19"/>
+                <w:szCs w:val="19"/>
+              </w:rPr>
+              <w:t xml:space="preserve">5.4. Biaya parkir dan biaya kerja lain yang telah disetujui sebelumnya diganti berdasarkan bukti pembayaran.</w:t>
             </w:r>
           </w:p>
         </w:tc>
@@ -2268,7 +2593,7 @@
                 <w:sz w:val="19"/>
                 <w:szCs w:val="19"/>
               </w:rPr>
-              <w:t xml:space="preserve">ARTICLE 5 — VEHICLE AND WORK EXPENSES</w:t>
+              <w:t xml:space="preserve">ARTICLE 6 — CLIENTS, PRICES AND PAYMENTS</w:t>
             </w:r>
           </w:p>
         </w:tc>
@@ -2302,295 +2627,275 @@
                 <w:sz w:val="19"/>
                 <w:szCs w:val="19"/>
               </w:rPr>
-              <w:t xml:space="preserve">PASAL 5 — KENDARAAN DAN BIAYA KERJA</w:t>
-            </w:r>
-          </w:p>
-        </w:tc>
-      </w:tr>
-      <w:tr>
-        <w:trPr>
-          <w:cantSplit w:val="false"/>
-        </w:trPr>
-        <w:tc>
-          <w:tcPr>
-            <w:tcW w:type="dxa" w:w="4953"/>
-            <w:tcBorders>
-              <w:top w:val="single" w:color="BFBFBF" w:sz="4"/>
-              <w:left w:val="single" w:color="BFBFBF" w:sz="4"/>
-              <w:bottom w:val="single" w:color="BFBFBF" w:sz="4"/>
-              <w:right w:val="single" w:color="BFBFBF" w:sz="4"/>
-            </w:tcBorders>
-            <w:tcMar>
-              <w:top w:type="dxa" w:w="60"/>
-              <w:left w:type="dxa" w:w="100"/>
-              <w:bottom w:type="dxa" w:w="60"/>
-              <w:right w:type="dxa" w:w="100"/>
-            </w:tcMar>
-          </w:tcPr>
-          <w:p>
-            <w:pPr>
-              <w:spacing w:after="80"/>
-              <w:jc w:val="left"/>
-            </w:pPr>
-            <w:r>
-              <w:rPr>
-                <w:rFonts w:ascii="Arial" w:cs="Arial" w:eastAsia="Arial" w:hAnsi="Arial"/>
-                <w:sz w:val="19"/>
-                <w:szCs w:val="19"/>
-              </w:rPr>
-              <w:t xml:space="preserve">5.1. The Employee performs work-related trips using his own motorbike or car and shall hold a valid driving license (SIM) and vehicle registration (STNK) at all times.</w:t>
-            </w:r>
-          </w:p>
-        </w:tc>
-        <w:tc>
-          <w:tcPr>
-            <w:tcW w:type="dxa" w:w="4953"/>
-            <w:tcBorders>
-              <w:top w:val="single" w:color="BFBFBF" w:sz="4"/>
-              <w:left w:val="single" w:color="BFBFBF" w:sz="4"/>
-              <w:bottom w:val="single" w:color="BFBFBF" w:sz="4"/>
-              <w:right w:val="single" w:color="BFBFBF" w:sz="4"/>
-            </w:tcBorders>
-            <w:tcMar>
-              <w:top w:type="dxa" w:w="60"/>
-              <w:left w:type="dxa" w:w="100"/>
-              <w:bottom w:type="dxa" w:w="60"/>
-              <w:right w:type="dxa" w:w="100"/>
-            </w:tcMar>
-          </w:tcPr>
-          <w:p>
-            <w:pPr>
-              <w:spacing w:after="80"/>
-              <w:jc w:val="left"/>
-            </w:pPr>
-            <w:r>
-              <w:rPr>
-                <w:rFonts w:ascii="Arial" w:cs="Arial" w:eastAsia="Arial" w:hAnsi="Arial"/>
-                <w:sz w:val="19"/>
-                <w:szCs w:val="19"/>
-              </w:rPr>
-              <w:t xml:space="preserve">5.1. Karyawan melakukan perjalanan dinas menggunakan sepeda motor atau mobil miliknya sendiri dan wajib selalu memiliki Surat Izin Mengemudi (SIM) dan Surat Tanda Nomor Kendaraan (STNK) yang berlaku.</w:t>
-            </w:r>
-          </w:p>
-        </w:tc>
-      </w:tr>
-      <w:tr>
-        <w:trPr>
-          <w:cantSplit w:val="false"/>
-        </w:trPr>
-        <w:tc>
-          <w:tcPr>
-            <w:tcW w:type="dxa" w:w="4953"/>
-            <w:tcBorders>
-              <w:top w:val="single" w:color="BFBFBF" w:sz="4"/>
-              <w:left w:val="single" w:color="BFBFBF" w:sz="4"/>
-              <w:bottom w:val="single" w:color="BFBFBF" w:sz="4"/>
-              <w:right w:val="single" w:color="BFBFBF" w:sz="4"/>
-            </w:tcBorders>
-            <w:tcMar>
-              <w:top w:type="dxa" w:w="60"/>
-              <w:left w:type="dxa" w:w="100"/>
-              <w:bottom w:type="dxa" w:w="60"/>
-              <w:right w:type="dxa" w:w="100"/>
-            </w:tcMar>
-          </w:tcPr>
-          <w:p>
-            <w:pPr>
-              <w:spacing w:after="80"/>
-              <w:jc w:val="left"/>
-            </w:pPr>
-            <w:r>
-              <w:rPr>
-                <w:rFonts w:ascii="Arial" w:cs="Arial" w:eastAsia="Arial" w:hAnsi="Arial"/>
-                <w:sz w:val="19"/>
-                <w:szCs w:val="19"/>
-              </w:rPr>
-              <w:t xml:space="preserve">5.2. Maintenance, repair and insurance of the vehicle, as well as traffic fines, are at the Employee's own expense.</w:t>
-            </w:r>
-          </w:p>
-        </w:tc>
-        <w:tc>
-          <w:tcPr>
-            <w:tcW w:type="dxa" w:w="4953"/>
-            <w:tcBorders>
-              <w:top w:val="single" w:color="BFBFBF" w:sz="4"/>
-              <w:left w:val="single" w:color="BFBFBF" w:sz="4"/>
-              <w:bottom w:val="single" w:color="BFBFBF" w:sz="4"/>
-              <w:right w:val="single" w:color="BFBFBF" w:sz="4"/>
-            </w:tcBorders>
-            <w:tcMar>
-              <w:top w:type="dxa" w:w="60"/>
-              <w:left w:type="dxa" w:w="100"/>
-              <w:bottom w:type="dxa" w:w="60"/>
-              <w:right w:type="dxa" w:w="100"/>
-            </w:tcMar>
-          </w:tcPr>
-          <w:p>
-            <w:pPr>
-              <w:spacing w:after="80"/>
-              <w:jc w:val="left"/>
-            </w:pPr>
-            <w:r>
-              <w:rPr>
-                <w:rFonts w:ascii="Arial" w:cs="Arial" w:eastAsia="Arial" w:hAnsi="Arial"/>
-                <w:sz w:val="19"/>
-                <w:szCs w:val="19"/>
-              </w:rPr>
-              <w:t xml:space="preserve">5.2. Biaya perawatan, perbaikan dan asuransi kendaraan, serta denda lalu lintas, menjadi tanggungan Karyawan sendiri.</w:t>
-            </w:r>
-          </w:p>
-        </w:tc>
-      </w:tr>
-      <w:tr>
-        <w:trPr>
-          <w:cantSplit w:val="false"/>
-        </w:trPr>
-        <w:tc>
-          <w:tcPr>
-            <w:tcW w:type="dxa" w:w="4953"/>
-            <w:tcBorders>
-              <w:top w:val="single" w:color="BFBFBF" w:sz="4"/>
-              <w:left w:val="single" w:color="BFBFBF" w:sz="4"/>
-              <w:bottom w:val="single" w:color="BFBFBF" w:sz="4"/>
-              <w:right w:val="single" w:color="BFBFBF" w:sz="4"/>
-            </w:tcBorders>
-            <w:tcMar>
-              <w:top w:type="dxa" w:w="60"/>
-              <w:left w:type="dxa" w:w="100"/>
-              <w:bottom w:type="dxa" w:w="60"/>
-              <w:right w:type="dxa" w:w="100"/>
-            </w:tcMar>
-          </w:tcPr>
-          <w:p>
-            <w:pPr>
-              <w:spacing w:after="80"/>
-              <w:jc w:val="left"/>
-            </w:pPr>
-            <w:r>
-              <w:rPr>
-                <w:rFonts w:ascii="Arial" w:cs="Arial" w:eastAsia="Arial" w:hAnsi="Arial"/>
-                <w:sz w:val="19"/>
-                <w:szCs w:val="19"/>
-              </w:rPr>
-              <w:t xml:space="preserve">5.3. Fuel for work-related trips is reimbursed by the Company weekly, every Monday, for trips made during the preceding Monday–Sunday period, based on the visit log submitted by the Employee. </w:t>
-            </w:r>
-            <w:r>
-              <w:rPr>
-                <w:rFonts w:ascii="Arial" w:cs="Arial" w:eastAsia="Arial" w:hAnsi="Arial"/>
-                <w:sz w:val="19"/>
-                <w:szCs w:val="19"/>
-                <w:highlight w:val="yellow"/>
-                <w:highlightCs w:val="yellow"/>
-              </w:rPr>
-              <w:t xml:space="preserve">[Alternative: a fixed transport allowance of IDR ________ per month.]</w:t>
-            </w:r>
-          </w:p>
-        </w:tc>
-        <w:tc>
-          <w:tcPr>
-            <w:tcW w:type="dxa" w:w="4953"/>
-            <w:tcBorders>
-              <w:top w:val="single" w:color="BFBFBF" w:sz="4"/>
-              <w:left w:val="single" w:color="BFBFBF" w:sz="4"/>
-              <w:bottom w:val="single" w:color="BFBFBF" w:sz="4"/>
-              <w:right w:val="single" w:color="BFBFBF" w:sz="4"/>
-            </w:tcBorders>
-            <w:tcMar>
-              <w:top w:type="dxa" w:w="60"/>
-              <w:left w:type="dxa" w:w="100"/>
-              <w:bottom w:type="dxa" w:w="60"/>
-              <w:right w:type="dxa" w:w="100"/>
-            </w:tcMar>
-          </w:tcPr>
-          <w:p>
-            <w:pPr>
-              <w:spacing w:after="80"/>
-              <w:jc w:val="left"/>
-            </w:pPr>
-            <w:r>
-              <w:rPr>
-                <w:rFonts w:ascii="Arial" w:cs="Arial" w:eastAsia="Arial" w:hAnsi="Arial"/>
-                <w:sz w:val="19"/>
-                <w:szCs w:val="19"/>
-              </w:rPr>
-              <w:t xml:space="preserve">5.3. Biaya bahan bakar untuk perjalanan dinas diganti oleh Perusahaan setiap minggu, pada hari Senin, untuk perjalanan periode Senin–Minggu sebelumnya, berdasarkan catatan kunjungan yang diserahkan Karyawan. </w:t>
-            </w:r>
-            <w:r>
-              <w:rPr>
-                <w:rFonts w:ascii="Arial" w:cs="Arial" w:eastAsia="Arial" w:hAnsi="Arial"/>
-                <w:sz w:val="19"/>
-                <w:szCs w:val="19"/>
-                <w:highlight w:val="yellow"/>
-                <w:highlightCs w:val="yellow"/>
-              </w:rPr>
-              <w:t xml:space="preserve">[Alternatif: tunjangan transportasi tetap sebesar Rp ________ per bulan.]</w:t>
-            </w:r>
-          </w:p>
-        </w:tc>
-      </w:tr>
-      <w:tr>
-        <w:trPr>
-          <w:cantSplit w:val="false"/>
-        </w:trPr>
-        <w:tc>
-          <w:tcPr>
-            <w:tcW w:type="dxa" w:w="4953"/>
-            <w:tcBorders>
-              <w:top w:val="single" w:color="BFBFBF" w:sz="4"/>
-              <w:left w:val="single" w:color="BFBFBF" w:sz="4"/>
-              <w:bottom w:val="single" w:color="BFBFBF" w:sz="4"/>
-              <w:right w:val="single" w:color="BFBFBF" w:sz="4"/>
-            </w:tcBorders>
-            <w:tcMar>
-              <w:top w:type="dxa" w:w="60"/>
-              <w:left w:type="dxa" w:w="100"/>
-              <w:bottom w:type="dxa" w:w="60"/>
-              <w:right w:type="dxa" w:w="100"/>
-            </w:tcMar>
-          </w:tcPr>
-          <w:p>
-            <w:pPr>
-              <w:spacing w:after="80"/>
-              <w:jc w:val="left"/>
-            </w:pPr>
-            <w:r>
-              <w:rPr>
-                <w:rFonts w:ascii="Arial" w:cs="Arial" w:eastAsia="Arial" w:hAnsi="Arial"/>
-                <w:sz w:val="19"/>
-                <w:szCs w:val="19"/>
-              </w:rPr>
-              <w:t xml:space="preserve">5.4. Parking and other pre-approved work expenses are reimbursed against receipts.</w:t>
-            </w:r>
-          </w:p>
-        </w:tc>
-        <w:tc>
-          <w:tcPr>
-            <w:tcW w:type="dxa" w:w="4953"/>
-            <w:tcBorders>
-              <w:top w:val="single" w:color="BFBFBF" w:sz="4"/>
-              <w:left w:val="single" w:color="BFBFBF" w:sz="4"/>
-              <w:bottom w:val="single" w:color="BFBFBF" w:sz="4"/>
-              <w:right w:val="single" w:color="BFBFBF" w:sz="4"/>
-            </w:tcBorders>
-            <w:tcMar>
-              <w:top w:type="dxa" w:w="60"/>
-              <w:left w:type="dxa" w:w="100"/>
-              <w:bottom w:type="dxa" w:w="60"/>
-              <w:right w:type="dxa" w:w="100"/>
-            </w:tcMar>
-          </w:tcPr>
-          <w:p>
-            <w:pPr>
-              <w:spacing w:after="80"/>
-              <w:jc w:val="left"/>
-            </w:pPr>
-            <w:r>
-              <w:rPr>
-                <w:rFonts w:ascii="Arial" w:cs="Arial" w:eastAsia="Arial" w:hAnsi="Arial"/>
-                <w:sz w:val="19"/>
-                <w:szCs w:val="19"/>
-              </w:rPr>
-              <w:t xml:space="preserve">5.4. Biaya parkir dan biaya kerja lain yang telah disetujui sebelumnya diganti berdasarkan bukti pembayaran.</w:t>
+              <w:t xml:space="preserve">PASAL 6 — KLIEN, HARGA DAN PEMBAYARAN</w:t>
+            </w:r>
+          </w:p>
+        </w:tc>
+      </w:tr>
+      <w:tr>
+        <w:trPr>
+          <w:cantSplit w:val="false"/>
+        </w:trPr>
+        <w:tc>
+          <w:tcPr>
+            <w:tcW w:type="dxa" w:w="4953"/>
+            <w:tcBorders>
+              <w:top w:val="single" w:color="BFBFBF" w:sz="4"/>
+              <w:left w:val="single" w:color="BFBFBF" w:sz="4"/>
+              <w:bottom w:val="single" w:color="BFBFBF" w:sz="4"/>
+              <w:right w:val="single" w:color="BFBFBF" w:sz="4"/>
+            </w:tcBorders>
+            <w:tcMar>
+              <w:top w:type="dxa" w:w="60"/>
+              <w:left w:type="dxa" w:w="100"/>
+              <w:bottom w:type="dxa" w:w="60"/>
+              <w:right w:type="dxa" w:w="100"/>
+            </w:tcMar>
+          </w:tcPr>
+          <w:p>
+            <w:pPr>
+              <w:spacing w:after="80"/>
+              <w:jc w:val="left"/>
+            </w:pPr>
+            <w:r>
+              <w:rPr>
+                <w:rFonts w:ascii="Arial" w:cs="Arial" w:eastAsia="Arial" w:hAnsi="Arial"/>
+                <w:sz w:val="19"/>
+                <w:szCs w:val="19"/>
+              </w:rPr>
+              <w:t xml:space="preserve">6.1. The Employee acts on behalf of the Company only within the limits of this Agreement and the Company's instructions. Quotations and invoices are issued only in the name of the Company, on the Company's forms and at the Company's current price list. Discounts and non-standard terms require prior written approval of the Director.</w:t>
+            </w:r>
+          </w:p>
+        </w:tc>
+        <w:tc>
+          <w:tcPr>
+            <w:tcW w:type="dxa" w:w="4953"/>
+            <w:tcBorders>
+              <w:top w:val="single" w:color="BFBFBF" w:sz="4"/>
+              <w:left w:val="single" w:color="BFBFBF" w:sz="4"/>
+              <w:bottom w:val="single" w:color="BFBFBF" w:sz="4"/>
+              <w:right w:val="single" w:color="BFBFBF" w:sz="4"/>
+            </w:tcBorders>
+            <w:tcMar>
+              <w:top w:type="dxa" w:w="60"/>
+              <w:left w:type="dxa" w:w="100"/>
+              <w:bottom w:type="dxa" w:w="60"/>
+              <w:right w:type="dxa" w:w="100"/>
+            </w:tcMar>
+          </w:tcPr>
+          <w:p>
+            <w:pPr>
+              <w:spacing w:after="80"/>
+              <w:jc w:val="left"/>
+            </w:pPr>
+            <w:r>
+              <w:rPr>
+                <w:rFonts w:ascii="Arial" w:cs="Arial" w:eastAsia="Arial" w:hAnsi="Arial"/>
+                <w:sz w:val="19"/>
+                <w:szCs w:val="19"/>
+              </w:rPr>
+              <w:t xml:space="preserve">6.1. Karyawan bertindak atas nama Perusahaan hanya dalam batas Perjanjian ini dan instruksi Perusahaan. Penawaran harga dan tagihan (invoice) hanya diterbitkan atas nama Perusahaan, menggunakan format Perusahaan dan sesuai daftar harga Perusahaan yang berlaku. Diskon dan syarat tidak standar memerlukan persetujuan tertulis Direktur terlebih dahulu.</w:t>
+            </w:r>
+          </w:p>
+        </w:tc>
+      </w:tr>
+      <w:tr>
+        <w:trPr>
+          <w:cantSplit w:val="false"/>
+        </w:trPr>
+        <w:tc>
+          <w:tcPr>
+            <w:tcW w:type="dxa" w:w="4953"/>
+            <w:tcBorders>
+              <w:top w:val="single" w:color="BFBFBF" w:sz="4"/>
+              <w:left w:val="single" w:color="BFBFBF" w:sz="4"/>
+              <w:bottom w:val="single" w:color="BFBFBF" w:sz="4"/>
+              <w:right w:val="single" w:color="BFBFBF" w:sz="4"/>
+            </w:tcBorders>
+            <w:tcMar>
+              <w:top w:type="dxa" w:w="60"/>
+              <w:left w:type="dxa" w:w="100"/>
+              <w:bottom w:type="dxa" w:w="60"/>
+              <w:right w:type="dxa" w:w="100"/>
+            </w:tcMar>
+          </w:tcPr>
+          <w:p>
+            <w:pPr>
+              <w:spacing w:after="80"/>
+              <w:jc w:val="left"/>
+            </w:pPr>
+            <w:r>
+              <w:rPr>
+                <w:rFonts w:ascii="Arial" w:cs="Arial" w:eastAsia="Arial" w:hAnsi="Arial"/>
+                <w:sz w:val="19"/>
+                <w:szCs w:val="19"/>
+              </w:rPr>
+              <w:t xml:space="preserve">6.2. All client payments are made only to the Company's bank account. The Employee is prohibited from receiving client payments to his personal account.</w:t>
+            </w:r>
+          </w:p>
+        </w:tc>
+        <w:tc>
+          <w:tcPr>
+            <w:tcW w:type="dxa" w:w="4953"/>
+            <w:tcBorders>
+              <w:top w:val="single" w:color="BFBFBF" w:sz="4"/>
+              <w:left w:val="single" w:color="BFBFBF" w:sz="4"/>
+              <w:bottom w:val="single" w:color="BFBFBF" w:sz="4"/>
+              <w:right w:val="single" w:color="BFBFBF" w:sz="4"/>
+            </w:tcBorders>
+            <w:tcMar>
+              <w:top w:type="dxa" w:w="60"/>
+              <w:left w:type="dxa" w:w="100"/>
+              <w:bottom w:type="dxa" w:w="60"/>
+              <w:right w:type="dxa" w:w="100"/>
+            </w:tcMar>
+          </w:tcPr>
+          <w:p>
+            <w:pPr>
+              <w:spacing w:after="80"/>
+              <w:jc w:val="left"/>
+            </w:pPr>
+            <w:r>
+              <w:rPr>
+                <w:rFonts w:ascii="Arial" w:cs="Arial" w:eastAsia="Arial" w:hAnsi="Arial"/>
+                <w:sz w:val="19"/>
+                <w:szCs w:val="19"/>
+              </w:rPr>
+              <w:t xml:space="preserve">6.2. Seluruh pembayaran klien dilakukan hanya ke rekening bank Perusahaan. Karyawan dilarang menerima pembayaran klien ke rekening pribadinya.</w:t>
+            </w:r>
+          </w:p>
+        </w:tc>
+      </w:tr>
+      <w:tr>
+        <w:trPr>
+          <w:cantSplit w:val="false"/>
+        </w:trPr>
+        <w:tc>
+          <w:tcPr>
+            <w:tcW w:type="dxa" w:w="4953"/>
+            <w:tcBorders>
+              <w:top w:val="single" w:color="BFBFBF" w:sz="4"/>
+              <w:left w:val="single" w:color="BFBFBF" w:sz="4"/>
+              <w:bottom w:val="single" w:color="BFBFBF" w:sz="4"/>
+              <w:right w:val="single" w:color="BFBFBF" w:sz="4"/>
+            </w:tcBorders>
+            <w:tcMar>
+              <w:top w:type="dxa" w:w="60"/>
+              <w:left w:type="dxa" w:w="100"/>
+              <w:bottom w:type="dxa" w:w="60"/>
+              <w:right w:type="dxa" w:w="100"/>
+            </w:tcMar>
+          </w:tcPr>
+          <w:p>
+            <w:pPr>
+              <w:spacing w:after="80"/>
+              <w:jc w:val="left"/>
+            </w:pPr>
+            <w:r>
+              <w:rPr>
+                <w:rFonts w:ascii="Arial" w:cs="Arial" w:eastAsia="Arial" w:hAnsi="Arial"/>
+                <w:sz w:val="19"/>
+                <w:szCs w:val="19"/>
+              </w:rPr>
+              <w:t xml:space="preserve">6.3. Cash may be accepted only with the prior permission of the Director, against a Company receipt, and must be handed over to the Company on the same day or no later than the next working day. The Employee is responsible for any shortage of funds received by him.</w:t>
+            </w:r>
+          </w:p>
+        </w:tc>
+        <w:tc>
+          <w:tcPr>
+            <w:tcW w:type="dxa" w:w="4953"/>
+            <w:tcBorders>
+              <w:top w:val="single" w:color="BFBFBF" w:sz="4"/>
+              <w:left w:val="single" w:color="BFBFBF" w:sz="4"/>
+              <w:bottom w:val="single" w:color="BFBFBF" w:sz="4"/>
+              <w:right w:val="single" w:color="BFBFBF" w:sz="4"/>
+            </w:tcBorders>
+            <w:tcMar>
+              <w:top w:type="dxa" w:w="60"/>
+              <w:left w:type="dxa" w:w="100"/>
+              <w:bottom w:type="dxa" w:w="60"/>
+              <w:right w:type="dxa" w:w="100"/>
+            </w:tcMar>
+          </w:tcPr>
+          <w:p>
+            <w:pPr>
+              <w:spacing w:after="80"/>
+              <w:jc w:val="left"/>
+            </w:pPr>
+            <w:r>
+              <w:rPr>
+                <w:rFonts w:ascii="Arial" w:cs="Arial" w:eastAsia="Arial" w:hAnsi="Arial"/>
+                <w:sz w:val="19"/>
+                <w:szCs w:val="19"/>
+              </w:rPr>
+              <w:t xml:space="preserve">6.3. Uang tunai hanya dapat diterima dengan izin Direktur terlebih dahulu, dengan kuitansi Perusahaan, dan wajib diserahkan kepada Perusahaan pada hari yang sama atau paling lambat pada hari kerja berikutnya. Karyawan bertanggung jawab atas setiap kekurangan dana yang diterimanya.</w:t>
+            </w:r>
+          </w:p>
+        </w:tc>
+      </w:tr>
+      <w:tr>
+        <w:trPr>
+          <w:cantSplit w:val="false"/>
+        </w:trPr>
+        <w:tc>
+          <w:tcPr>
+            <w:tcW w:type="dxa" w:w="4953"/>
+            <w:tcBorders>
+              <w:top w:val="single" w:color="BFBFBF" w:sz="4"/>
+              <w:left w:val="single" w:color="BFBFBF" w:sz="4"/>
+              <w:bottom w:val="single" w:color="BFBFBF" w:sz="4"/>
+              <w:right w:val="single" w:color="BFBFBF" w:sz="4"/>
+            </w:tcBorders>
+            <w:tcMar>
+              <w:top w:type="dxa" w:w="60"/>
+              <w:left w:type="dxa" w:w="100"/>
+              <w:bottom w:type="dxa" w:w="60"/>
+              <w:right w:type="dxa" w:w="100"/>
+            </w:tcMar>
+          </w:tcPr>
+          <w:p>
+            <w:pPr>
+              <w:spacing w:after="80"/>
+              <w:jc w:val="left"/>
+            </w:pPr>
+            <w:r>
+              <w:rPr>
+                <w:rFonts w:ascii="Arial" w:cs="Arial" w:eastAsia="Arial" w:hAnsi="Arial"/>
+                <w:sz w:val="19"/>
+                <w:szCs w:val="19"/>
+              </w:rPr>
+              <w:t xml:space="preserve">6.4. The Employee shall not provide the Company's services or sell similar services or materials to clients privately or through third parties.</w:t>
+            </w:r>
+          </w:p>
+        </w:tc>
+        <w:tc>
+          <w:tcPr>
+            <w:tcW w:type="dxa" w:w="4953"/>
+            <w:tcBorders>
+              <w:top w:val="single" w:color="BFBFBF" w:sz="4"/>
+              <w:left w:val="single" w:color="BFBFBF" w:sz="4"/>
+              <w:bottom w:val="single" w:color="BFBFBF" w:sz="4"/>
+              <w:right w:val="single" w:color="BFBFBF" w:sz="4"/>
+            </w:tcBorders>
+            <w:tcMar>
+              <w:top w:type="dxa" w:w="60"/>
+              <w:left w:type="dxa" w:w="100"/>
+              <w:bottom w:type="dxa" w:w="60"/>
+              <w:right w:type="dxa" w:w="100"/>
+            </w:tcMar>
+          </w:tcPr>
+          <w:p>
+            <w:pPr>
+              <w:spacing w:after="80"/>
+              <w:jc w:val="left"/>
+            </w:pPr>
+            <w:r>
+              <w:rPr>
+                <w:rFonts w:ascii="Arial" w:cs="Arial" w:eastAsia="Arial" w:hAnsi="Arial"/>
+                <w:sz w:val="19"/>
+                <w:szCs w:val="19"/>
+              </w:rPr>
+              <w:t xml:space="preserve">6.4. Karyawan dilarang memberikan jasa Perusahaan atau menjual jasa atau bahan sejenis kepada klien secara pribadi atau melalui pihak ketiga.</w:t>
             </w:r>
           </w:p>
         </w:tc>
@@ -2629,7 +2934,7 @@
                 <w:sz w:val="19"/>
                 <w:szCs w:val="19"/>
               </w:rPr>
-              <w:t xml:space="preserve">ARTICLE 6 — CLIENTS, PRICES AND PAYMENTS</w:t>
+              <w:t xml:space="preserve">ARTICLE 7 — SOCIAL SECURITY</w:t>
             </w:r>
           </w:p>
         </w:tc>
@@ -2663,347 +2968,6 @@
                 <w:sz w:val="19"/>
                 <w:szCs w:val="19"/>
               </w:rPr>
-              <w:t xml:space="preserve">PASAL 6 — KLIEN, HARGA DAN PEMBAYARAN</w:t>
-            </w:r>
-          </w:p>
-        </w:tc>
-      </w:tr>
-      <w:tr>
-        <w:trPr>
-          <w:cantSplit w:val="false"/>
-        </w:trPr>
-        <w:tc>
-          <w:tcPr>
-            <w:tcW w:type="dxa" w:w="4953"/>
-            <w:tcBorders>
-              <w:top w:val="single" w:color="BFBFBF" w:sz="4"/>
-              <w:left w:val="single" w:color="BFBFBF" w:sz="4"/>
-              <w:bottom w:val="single" w:color="BFBFBF" w:sz="4"/>
-              <w:right w:val="single" w:color="BFBFBF" w:sz="4"/>
-            </w:tcBorders>
-            <w:tcMar>
-              <w:top w:type="dxa" w:w="60"/>
-              <w:left w:type="dxa" w:w="100"/>
-              <w:bottom w:type="dxa" w:w="60"/>
-              <w:right w:type="dxa" w:w="100"/>
-            </w:tcMar>
-          </w:tcPr>
-          <w:p>
-            <w:pPr>
-              <w:spacing w:after="80"/>
-              <w:jc w:val="left"/>
-            </w:pPr>
-            <w:r>
-              <w:rPr>
-                <w:rFonts w:ascii="Arial" w:cs="Arial" w:eastAsia="Arial" w:hAnsi="Arial"/>
-                <w:sz w:val="19"/>
-                <w:szCs w:val="19"/>
-              </w:rPr>
-              <w:t xml:space="preserve">6.1. The Employee acts on behalf of the Company only within the limits of this Agreement and the Company's instructions. Quotations and invoices are issued only in the name of the Company, on the Company's forms and at the Company's current price list. Discounts and non-standard terms require prior written approval of the Director.</w:t>
-            </w:r>
-          </w:p>
-        </w:tc>
-        <w:tc>
-          <w:tcPr>
-            <w:tcW w:type="dxa" w:w="4953"/>
-            <w:tcBorders>
-              <w:top w:val="single" w:color="BFBFBF" w:sz="4"/>
-              <w:left w:val="single" w:color="BFBFBF" w:sz="4"/>
-              <w:bottom w:val="single" w:color="BFBFBF" w:sz="4"/>
-              <w:right w:val="single" w:color="BFBFBF" w:sz="4"/>
-            </w:tcBorders>
-            <w:tcMar>
-              <w:top w:type="dxa" w:w="60"/>
-              <w:left w:type="dxa" w:w="100"/>
-              <w:bottom w:type="dxa" w:w="60"/>
-              <w:right w:type="dxa" w:w="100"/>
-            </w:tcMar>
-          </w:tcPr>
-          <w:p>
-            <w:pPr>
-              <w:spacing w:after="80"/>
-              <w:jc w:val="left"/>
-            </w:pPr>
-            <w:r>
-              <w:rPr>
-                <w:rFonts w:ascii="Arial" w:cs="Arial" w:eastAsia="Arial" w:hAnsi="Arial"/>
-                <w:sz w:val="19"/>
-                <w:szCs w:val="19"/>
-              </w:rPr>
-              <w:t xml:space="preserve">6.1. Karyawan bertindak atas nama Perusahaan hanya dalam batas Perjanjian ini dan instruksi Perusahaan. Penawaran harga dan tagihan (invoice) hanya diterbitkan atas nama Perusahaan, menggunakan format Perusahaan dan sesuai daftar harga Perusahaan yang berlaku. Diskon dan syarat tidak standar memerlukan persetujuan tertulis Direktur terlebih dahulu.</w:t>
-            </w:r>
-          </w:p>
-        </w:tc>
-      </w:tr>
-      <w:tr>
-        <w:trPr>
-          <w:cantSplit w:val="false"/>
-        </w:trPr>
-        <w:tc>
-          <w:tcPr>
-            <w:tcW w:type="dxa" w:w="4953"/>
-            <w:tcBorders>
-              <w:top w:val="single" w:color="BFBFBF" w:sz="4"/>
-              <w:left w:val="single" w:color="BFBFBF" w:sz="4"/>
-              <w:bottom w:val="single" w:color="BFBFBF" w:sz="4"/>
-              <w:right w:val="single" w:color="BFBFBF" w:sz="4"/>
-            </w:tcBorders>
-            <w:tcMar>
-              <w:top w:type="dxa" w:w="60"/>
-              <w:left w:type="dxa" w:w="100"/>
-              <w:bottom w:type="dxa" w:w="60"/>
-              <w:right w:type="dxa" w:w="100"/>
-            </w:tcMar>
-          </w:tcPr>
-          <w:p>
-            <w:pPr>
-              <w:spacing w:after="80"/>
-              <w:jc w:val="left"/>
-            </w:pPr>
-            <w:r>
-              <w:rPr>
-                <w:rFonts w:ascii="Arial" w:cs="Arial" w:eastAsia="Arial" w:hAnsi="Arial"/>
-                <w:sz w:val="19"/>
-                <w:szCs w:val="19"/>
-              </w:rPr>
-              <w:t xml:space="preserve">6.2. All client payments are made only to the Company's bank account. The Employee is prohibited from receiving client payments to his personal account.</w:t>
-            </w:r>
-          </w:p>
-        </w:tc>
-        <w:tc>
-          <w:tcPr>
-            <w:tcW w:type="dxa" w:w="4953"/>
-            <w:tcBorders>
-              <w:top w:val="single" w:color="BFBFBF" w:sz="4"/>
-              <w:left w:val="single" w:color="BFBFBF" w:sz="4"/>
-              <w:bottom w:val="single" w:color="BFBFBF" w:sz="4"/>
-              <w:right w:val="single" w:color="BFBFBF" w:sz="4"/>
-            </w:tcBorders>
-            <w:tcMar>
-              <w:top w:type="dxa" w:w="60"/>
-              <w:left w:type="dxa" w:w="100"/>
-              <w:bottom w:type="dxa" w:w="60"/>
-              <w:right w:type="dxa" w:w="100"/>
-            </w:tcMar>
-          </w:tcPr>
-          <w:p>
-            <w:pPr>
-              <w:spacing w:after="80"/>
-              <w:jc w:val="left"/>
-            </w:pPr>
-            <w:r>
-              <w:rPr>
-                <w:rFonts w:ascii="Arial" w:cs="Arial" w:eastAsia="Arial" w:hAnsi="Arial"/>
-                <w:sz w:val="19"/>
-                <w:szCs w:val="19"/>
-              </w:rPr>
-              <w:t xml:space="preserve">6.2. Seluruh pembayaran klien dilakukan hanya ke rekening bank Perusahaan. Karyawan dilarang menerima pembayaran klien ke rekening pribadinya.</w:t>
-            </w:r>
-          </w:p>
-        </w:tc>
-      </w:tr>
-      <w:tr>
-        <w:trPr>
-          <w:cantSplit w:val="false"/>
-        </w:trPr>
-        <w:tc>
-          <w:tcPr>
-            <w:tcW w:type="dxa" w:w="4953"/>
-            <w:tcBorders>
-              <w:top w:val="single" w:color="BFBFBF" w:sz="4"/>
-              <w:left w:val="single" w:color="BFBFBF" w:sz="4"/>
-              <w:bottom w:val="single" w:color="BFBFBF" w:sz="4"/>
-              <w:right w:val="single" w:color="BFBFBF" w:sz="4"/>
-            </w:tcBorders>
-            <w:tcMar>
-              <w:top w:type="dxa" w:w="60"/>
-              <w:left w:type="dxa" w:w="100"/>
-              <w:bottom w:type="dxa" w:w="60"/>
-              <w:right w:type="dxa" w:w="100"/>
-            </w:tcMar>
-          </w:tcPr>
-          <w:p>
-            <w:pPr>
-              <w:spacing w:after="80"/>
-              <w:jc w:val="left"/>
-            </w:pPr>
-            <w:r>
-              <w:rPr>
-                <w:rFonts w:ascii="Arial" w:cs="Arial" w:eastAsia="Arial" w:hAnsi="Arial"/>
-                <w:sz w:val="19"/>
-                <w:szCs w:val="19"/>
-              </w:rPr>
-              <w:t xml:space="preserve">6.3. Cash may be accepted only with the prior permission of the Director, against a Company receipt, and must be handed over to the Company on the same day or no later than the next working day. The Employee is responsible for any shortage of funds received by him.</w:t>
-            </w:r>
-          </w:p>
-        </w:tc>
-        <w:tc>
-          <w:tcPr>
-            <w:tcW w:type="dxa" w:w="4953"/>
-            <w:tcBorders>
-              <w:top w:val="single" w:color="BFBFBF" w:sz="4"/>
-              <w:left w:val="single" w:color="BFBFBF" w:sz="4"/>
-              <w:bottom w:val="single" w:color="BFBFBF" w:sz="4"/>
-              <w:right w:val="single" w:color="BFBFBF" w:sz="4"/>
-            </w:tcBorders>
-            <w:tcMar>
-              <w:top w:type="dxa" w:w="60"/>
-              <w:left w:type="dxa" w:w="100"/>
-              <w:bottom w:type="dxa" w:w="60"/>
-              <w:right w:type="dxa" w:w="100"/>
-            </w:tcMar>
-          </w:tcPr>
-          <w:p>
-            <w:pPr>
-              <w:spacing w:after="80"/>
-              <w:jc w:val="left"/>
-            </w:pPr>
-            <w:r>
-              <w:rPr>
-                <w:rFonts w:ascii="Arial" w:cs="Arial" w:eastAsia="Arial" w:hAnsi="Arial"/>
-                <w:sz w:val="19"/>
-                <w:szCs w:val="19"/>
-              </w:rPr>
-              <w:t xml:space="preserve">6.3. Uang tunai hanya dapat diterima dengan izin Direktur terlebih dahulu, dengan kuitansi Perusahaan, dan wajib diserahkan kepada Perusahaan pada hari yang sama atau paling lambat pada hari kerja berikutnya. Karyawan bertanggung jawab atas setiap kekurangan dana yang diterimanya.</w:t>
-            </w:r>
-          </w:p>
-        </w:tc>
-      </w:tr>
-      <w:tr>
-        <w:trPr>
-          <w:cantSplit w:val="false"/>
-        </w:trPr>
-        <w:tc>
-          <w:tcPr>
-            <w:tcW w:type="dxa" w:w="4953"/>
-            <w:tcBorders>
-              <w:top w:val="single" w:color="BFBFBF" w:sz="4"/>
-              <w:left w:val="single" w:color="BFBFBF" w:sz="4"/>
-              <w:bottom w:val="single" w:color="BFBFBF" w:sz="4"/>
-              <w:right w:val="single" w:color="BFBFBF" w:sz="4"/>
-            </w:tcBorders>
-            <w:tcMar>
-              <w:top w:type="dxa" w:w="60"/>
-              <w:left w:type="dxa" w:w="100"/>
-              <w:bottom w:type="dxa" w:w="60"/>
-              <w:right w:type="dxa" w:w="100"/>
-            </w:tcMar>
-          </w:tcPr>
-          <w:p>
-            <w:pPr>
-              <w:spacing w:after="80"/>
-              <w:jc w:val="left"/>
-            </w:pPr>
-            <w:r>
-              <w:rPr>
-                <w:rFonts w:ascii="Arial" w:cs="Arial" w:eastAsia="Arial" w:hAnsi="Arial"/>
-                <w:sz w:val="19"/>
-                <w:szCs w:val="19"/>
-              </w:rPr>
-              <w:t xml:space="preserve">6.4. The Employee shall not provide the Company's services or sell similar services or materials to clients privately or through third parties.</w:t>
-            </w:r>
-          </w:p>
-        </w:tc>
-        <w:tc>
-          <w:tcPr>
-            <w:tcW w:type="dxa" w:w="4953"/>
-            <w:tcBorders>
-              <w:top w:val="single" w:color="BFBFBF" w:sz="4"/>
-              <w:left w:val="single" w:color="BFBFBF" w:sz="4"/>
-              <w:bottom w:val="single" w:color="BFBFBF" w:sz="4"/>
-              <w:right w:val="single" w:color="BFBFBF" w:sz="4"/>
-            </w:tcBorders>
-            <w:tcMar>
-              <w:top w:type="dxa" w:w="60"/>
-              <w:left w:type="dxa" w:w="100"/>
-              <w:bottom w:type="dxa" w:w="60"/>
-              <w:right w:type="dxa" w:w="100"/>
-            </w:tcMar>
-          </w:tcPr>
-          <w:p>
-            <w:pPr>
-              <w:spacing w:after="80"/>
-              <w:jc w:val="left"/>
-            </w:pPr>
-            <w:r>
-              <w:rPr>
-                <w:rFonts w:ascii="Arial" w:cs="Arial" w:eastAsia="Arial" w:hAnsi="Arial"/>
-                <w:sz w:val="19"/>
-                <w:szCs w:val="19"/>
-              </w:rPr>
-              <w:t xml:space="preserve">6.4. Karyawan dilarang memberikan jasa Perusahaan atau menjual jasa atau bahan sejenis kepada klien secara pribadi atau melalui pihak ketiga.</w:t>
-            </w:r>
-          </w:p>
-        </w:tc>
-      </w:tr>
-      <w:tr>
-        <w:trPr>
-          <w:cantSplit w:val="false"/>
-        </w:trPr>
-        <w:tc>
-          <w:tcPr>
-            <w:tcW w:type="dxa" w:w="4953"/>
-            <w:tcBorders>
-              <w:top w:val="single" w:color="BFBFBF" w:sz="4"/>
-              <w:left w:val="single" w:color="BFBFBF" w:sz="4"/>
-              <w:bottom w:val="single" w:color="BFBFBF" w:sz="4"/>
-              <w:right w:val="single" w:color="BFBFBF" w:sz="4"/>
-            </w:tcBorders>
-            <w:shd w:fill="EAF1F8" w:color="auto" w:val="clear"/>
-            <w:tcMar>
-              <w:top w:type="dxa" w:w="60"/>
-              <w:left w:type="dxa" w:w="100"/>
-              <w:bottom w:type="dxa" w:w="60"/>
-              <w:right w:type="dxa" w:w="100"/>
-            </w:tcMar>
-          </w:tcPr>
-          <w:p>
-            <w:pPr>
-              <w:spacing w:after="80"/>
-              <w:jc w:val="left"/>
-            </w:pPr>
-            <w:r>
-              <w:rPr>
-                <w:rFonts w:ascii="Arial" w:cs="Arial" w:eastAsia="Arial" w:hAnsi="Arial"/>
-                <w:b/>
-                <w:bCs/>
-                <w:sz w:val="19"/>
-                <w:szCs w:val="19"/>
-              </w:rPr>
-              <w:t xml:space="preserve">ARTICLE 7 — SOCIAL SECURITY</w:t>
-            </w:r>
-          </w:p>
-        </w:tc>
-        <w:tc>
-          <w:tcPr>
-            <w:tcW w:type="dxa" w:w="4953"/>
-            <w:tcBorders>
-              <w:top w:val="single" w:color="BFBFBF" w:sz="4"/>
-              <w:left w:val="single" w:color="BFBFBF" w:sz="4"/>
-              <w:bottom w:val="single" w:color="BFBFBF" w:sz="4"/>
-              <w:right w:val="single" w:color="BFBFBF" w:sz="4"/>
-            </w:tcBorders>
-            <w:shd w:fill="EAF1F8" w:color="auto" w:val="clear"/>
-            <w:tcMar>
-              <w:top w:type="dxa" w:w="60"/>
-              <w:left w:type="dxa" w:w="100"/>
-              <w:bottom w:type="dxa" w:w="60"/>
-              <w:right w:type="dxa" w:w="100"/>
-            </w:tcMar>
-          </w:tcPr>
-          <w:p>
-            <w:pPr>
-              <w:spacing w:after="80"/>
-              <w:jc w:val="left"/>
-            </w:pPr>
-            <w:r>
-              <w:rPr>
-                <w:rFonts w:ascii="Arial" w:cs="Arial" w:eastAsia="Arial" w:hAnsi="Arial"/>
-                <w:b/>
-                <w:bCs/>
-                <w:sz w:val="19"/>
-                <w:szCs w:val="19"/>
-              </w:rPr>
               <w:t xml:space="preserve">PASAL 7 — JAMINAN SOSIAL</w:t>
             </w:r>
           </w:p>
@@ -3040,38 +3004,38 @@
                 <w:sz w:val="19"/>
                 <w:szCs w:val="19"/>
               </w:rPr>
-              <w:t xml:space="preserve">The Company registers the Employee in BPJS Ketenagakerjaan and BPJS Kesehatan programs from the start of employment. Contributions are paid in the proportions established by law; the Employee's share is deducted from the salary.</w:t>
-            </w:r>
-          </w:p>
-        </w:tc>
-        <w:tc>
-          <w:tcPr>
-            <w:tcW w:type="dxa" w:w="4953"/>
-            <w:tcBorders>
-              <w:top w:val="single" w:color="BFBFBF" w:sz="4"/>
-              <w:left w:val="single" w:color="BFBFBF" w:sz="4"/>
-              <w:bottom w:val="single" w:color="BFBFBF" w:sz="4"/>
-              <w:right w:val="single" w:color="BFBFBF" w:sz="4"/>
-            </w:tcBorders>
-            <w:tcMar>
-              <w:top w:type="dxa" w:w="60"/>
-              <w:left w:type="dxa" w:w="100"/>
-              <w:bottom w:type="dxa" w:w="60"/>
-              <w:right w:type="dxa" w:w="100"/>
-            </w:tcMar>
-          </w:tcPr>
-          <w:p>
-            <w:pPr>
-              <w:spacing w:after="80"/>
-              <w:jc w:val="left"/>
-            </w:pPr>
-            <w:r>
-              <w:rPr>
-                <w:rFonts w:ascii="Arial" w:cs="Arial" w:eastAsia="Arial" w:hAnsi="Arial"/>
-                <w:sz w:val="19"/>
-                <w:szCs w:val="19"/>
-              </w:rPr>
-              <w:t xml:space="preserve">Perusahaan mendaftarkan Karyawan dalam program BPJS Ketenagakerjaan dan BPJS Kesehatan sejak awal hubungan kerja. Iuran dibayar sesuai proporsi yang ditetapkan peraturan perundang-undangan; bagian Karyawan dipotong dari upah.</w:t>
+              <w:t xml:space="preserve">The Company registers the Employee in BPJS Ketenagakerjaan and BPJS Kesehatan programs from the start of employment. Contributions are paid in the proportions established by law; the Employee's share is borne by the Company in accordance with Article 4.4.</w:t>
+            </w:r>
+          </w:p>
+        </w:tc>
+        <w:tc>
+          <w:tcPr>
+            <w:tcW w:type="dxa" w:w="4953"/>
+            <w:tcBorders>
+              <w:top w:val="single" w:color="BFBFBF" w:sz="4"/>
+              <w:left w:val="single" w:color="BFBFBF" w:sz="4"/>
+              <w:bottom w:val="single" w:color="BFBFBF" w:sz="4"/>
+              <w:right w:val="single" w:color="BFBFBF" w:sz="4"/>
+            </w:tcBorders>
+            <w:tcMar>
+              <w:top w:type="dxa" w:w="60"/>
+              <w:left w:type="dxa" w:w="100"/>
+              <w:bottom w:type="dxa" w:w="60"/>
+              <w:right w:type="dxa" w:w="100"/>
+            </w:tcMar>
+          </w:tcPr>
+          <w:p>
+            <w:pPr>
+              <w:spacing w:after="80"/>
+              <w:jc w:val="left"/>
+            </w:pPr>
+            <w:r>
+              <w:rPr>
+                <w:rFonts w:ascii="Arial" w:cs="Arial" w:eastAsia="Arial" w:hAnsi="Arial"/>
+                <w:sz w:val="19"/>
+                <w:szCs w:val="19"/>
+              </w:rPr>
+              <w:t xml:space="preserve">Perusahaan mendaftarkan Karyawan dalam program BPJS Ketenagakerjaan dan BPJS Kesehatan sejak awal hubungan kerja. Iuran dibayar sesuai proporsi yang ditetapkan peraturan perundang-undangan; bagian Karyawan ditanggung Perusahaan sesuai Pasal 4.4.</w:t>
             </w:r>
           </w:p>
         </w:tc>
@@ -5059,7 +5023,7 @@
           <w:sz w:val="19"/>
           <w:szCs w:val="19"/>
         </w:rPr>
-        <w:t xml:space="preserve">Project Manager (Sales &amp; Client Projects) / Project Manager (Penjualan &amp; Proyek Klien)</w:t>
+        <w:t xml:space="preserve">Sales Manager — Waterproofing &amp; Villa Maintenance / Sales Manager — Waterproofing &amp; Perawatan Villa</w:t>
       </w:r>
     </w:p>
     <w:tbl>
@@ -5182,7 +5146,7 @@
                 <w:sz w:val="19"/>
                 <w:szCs w:val="19"/>
               </w:rPr>
-              <w:t xml:space="preserve">1. Receive client requests and addresses from the Company; contact clients, agree on visit times.</w:t>
+              <w:t xml:space="preserve">1. Receive client requests and addresses from the Company; contact clients and agree on visit times.</w:t>
             </w:r>
           </w:p>
         </w:tc>
@@ -5249,460 +5213,507 @@
                 <w:sz w:val="19"/>
                 <w:szCs w:val="19"/>
               </w:rPr>
-              <w:t xml:space="preserve">2. Visit clients on site, inspect the object and take measurements; record results with photos.</w:t>
-            </w:r>
-          </w:p>
-        </w:tc>
-        <w:tc>
-          <w:tcPr>
-            <w:tcW w:type="dxa" w:w="4953"/>
-            <w:tcBorders>
-              <w:top w:val="single" w:color="BFBFBF" w:sz="4"/>
-              <w:left w:val="single" w:color="BFBFBF" w:sz="4"/>
-              <w:bottom w:val="single" w:color="BFBFBF" w:sz="4"/>
-              <w:right w:val="single" w:color="BFBFBF" w:sz="4"/>
-            </w:tcBorders>
-            <w:tcMar>
-              <w:top w:type="dxa" w:w="60"/>
-              <w:left w:type="dxa" w:w="100"/>
-              <w:bottom w:type="dxa" w:w="60"/>
-              <w:right w:type="dxa" w:w="100"/>
-            </w:tcMar>
-          </w:tcPr>
-          <w:p>
-            <w:pPr>
-              <w:spacing w:after="80"/>
-              <w:jc w:val="left"/>
-            </w:pPr>
-            <w:r>
-              <w:rPr>
-                <w:rFonts w:ascii="Arial" w:cs="Arial" w:eastAsia="Arial" w:hAnsi="Arial"/>
-                <w:sz w:val="19"/>
-                <w:szCs w:val="19"/>
-              </w:rPr>
-              <w:t xml:space="preserve">2. Mengunjungi klien di lokasi, memeriksa objek dan melakukan pengukuran; mencatat hasil dengan foto.</w:t>
-            </w:r>
-          </w:p>
-        </w:tc>
-      </w:tr>
-      <w:tr>
-        <w:trPr>
-          <w:cantSplit w:val="false"/>
-        </w:trPr>
-        <w:tc>
-          <w:tcPr>
-            <w:tcW w:type="dxa" w:w="4953"/>
-            <w:tcBorders>
-              <w:top w:val="single" w:color="BFBFBF" w:sz="4"/>
-              <w:left w:val="single" w:color="BFBFBF" w:sz="4"/>
-              <w:bottom w:val="single" w:color="BFBFBF" w:sz="4"/>
-              <w:right w:val="single" w:color="BFBFBF" w:sz="4"/>
-            </w:tcBorders>
-            <w:tcMar>
-              <w:top w:type="dxa" w:w="60"/>
-              <w:left w:type="dxa" w:w="100"/>
-              <w:bottom w:type="dxa" w:w="60"/>
-              <w:right w:type="dxa" w:w="100"/>
-            </w:tcMar>
-          </w:tcPr>
-          <w:p>
-            <w:pPr>
-              <w:spacing w:after="80"/>
-              <w:jc w:val="left"/>
-            </w:pPr>
-            <w:r>
-              <w:rPr>
-                <w:rFonts w:ascii="Arial" w:cs="Arial" w:eastAsia="Arial" w:hAnsi="Arial"/>
-                <w:sz w:val="19"/>
-                <w:szCs w:val="19"/>
-              </w:rPr>
-              <w:t xml:space="preserve">3. Prepare quotations and issue invoices on behalf of the Company according to the price list.</w:t>
-            </w:r>
-          </w:p>
-        </w:tc>
-        <w:tc>
-          <w:tcPr>
-            <w:tcW w:type="dxa" w:w="4953"/>
-            <w:tcBorders>
-              <w:top w:val="single" w:color="BFBFBF" w:sz="4"/>
-              <w:left w:val="single" w:color="BFBFBF" w:sz="4"/>
-              <w:bottom w:val="single" w:color="BFBFBF" w:sz="4"/>
-              <w:right w:val="single" w:color="BFBFBF" w:sz="4"/>
-            </w:tcBorders>
-            <w:tcMar>
-              <w:top w:type="dxa" w:w="60"/>
-              <w:left w:type="dxa" w:w="100"/>
-              <w:bottom w:type="dxa" w:w="60"/>
-              <w:right w:type="dxa" w:w="100"/>
-            </w:tcMar>
-          </w:tcPr>
-          <w:p>
-            <w:pPr>
-              <w:spacing w:after="80"/>
-              <w:jc w:val="left"/>
-            </w:pPr>
-            <w:r>
-              <w:rPr>
-                <w:rFonts w:ascii="Arial" w:cs="Arial" w:eastAsia="Arial" w:hAnsi="Arial"/>
-                <w:sz w:val="19"/>
-                <w:szCs w:val="19"/>
-              </w:rPr>
-              <w:t xml:space="preserve">3. Menyiapkan penawaran harga dan menerbitkan invoice atas nama Perusahaan sesuai daftar harga.</w:t>
-            </w:r>
-          </w:p>
-        </w:tc>
-      </w:tr>
-      <w:tr>
-        <w:trPr>
-          <w:cantSplit w:val="false"/>
-        </w:trPr>
-        <w:tc>
-          <w:tcPr>
-            <w:tcW w:type="dxa" w:w="4953"/>
-            <w:tcBorders>
-              <w:top w:val="single" w:color="BFBFBF" w:sz="4"/>
-              <w:left w:val="single" w:color="BFBFBF" w:sz="4"/>
-              <w:bottom w:val="single" w:color="BFBFBF" w:sz="4"/>
-              <w:right w:val="single" w:color="BFBFBF" w:sz="4"/>
-            </w:tcBorders>
-            <w:tcMar>
-              <w:top w:type="dxa" w:w="60"/>
-              <w:left w:type="dxa" w:w="100"/>
-              <w:bottom w:type="dxa" w:w="60"/>
-              <w:right w:type="dxa" w:w="100"/>
-            </w:tcMar>
-          </w:tcPr>
-          <w:p>
-            <w:pPr>
-              <w:spacing w:after="80"/>
-              <w:jc w:val="left"/>
-            </w:pPr>
-            <w:r>
-              <w:rPr>
-                <w:rFonts w:ascii="Arial" w:cs="Arial" w:eastAsia="Arial" w:hAnsi="Arial"/>
-                <w:sz w:val="19"/>
-                <w:szCs w:val="19"/>
-              </w:rPr>
-              <w:t xml:space="preserve">4. Present and sell the Company's services and materials; negotiate with clients and conduct correspondence.</w:t>
-            </w:r>
-          </w:p>
-        </w:tc>
-        <w:tc>
-          <w:tcPr>
-            <w:tcW w:type="dxa" w:w="4953"/>
-            <w:tcBorders>
-              <w:top w:val="single" w:color="BFBFBF" w:sz="4"/>
-              <w:left w:val="single" w:color="BFBFBF" w:sz="4"/>
-              <w:bottom w:val="single" w:color="BFBFBF" w:sz="4"/>
-              <w:right w:val="single" w:color="BFBFBF" w:sz="4"/>
-            </w:tcBorders>
-            <w:tcMar>
-              <w:top w:type="dxa" w:w="60"/>
-              <w:left w:type="dxa" w:w="100"/>
-              <w:bottom w:type="dxa" w:w="60"/>
-              <w:right w:type="dxa" w:w="100"/>
-            </w:tcMar>
-          </w:tcPr>
-          <w:p>
-            <w:pPr>
-              <w:spacing w:after="80"/>
-              <w:jc w:val="left"/>
-            </w:pPr>
-            <w:r>
-              <w:rPr>
-                <w:rFonts w:ascii="Arial" w:cs="Arial" w:eastAsia="Arial" w:hAnsi="Arial"/>
-                <w:sz w:val="19"/>
-                <w:szCs w:val="19"/>
-              </w:rPr>
-              <w:t xml:space="preserve">4. Mempresentasikan dan menjual jasa serta bahan Perusahaan; bernegosiasi dan melakukan korespondensi dengan klien.</w:t>
-            </w:r>
-          </w:p>
-        </w:tc>
-      </w:tr>
-      <w:tr>
-        <w:trPr>
-          <w:cantSplit w:val="false"/>
-        </w:trPr>
-        <w:tc>
-          <w:tcPr>
-            <w:tcW w:type="dxa" w:w="4953"/>
-            <w:tcBorders>
-              <w:top w:val="single" w:color="BFBFBF" w:sz="4"/>
-              <w:left w:val="single" w:color="BFBFBF" w:sz="4"/>
-              <w:bottom w:val="single" w:color="BFBFBF" w:sz="4"/>
-              <w:right w:val="single" w:color="BFBFBF" w:sz="4"/>
-            </w:tcBorders>
-            <w:tcMar>
-              <w:top w:type="dxa" w:w="60"/>
-              <w:left w:type="dxa" w:w="100"/>
-              <w:bottom w:type="dxa" w:w="60"/>
-              <w:right w:type="dxa" w:w="100"/>
-            </w:tcMar>
-          </w:tcPr>
-          <w:p>
-            <w:pPr>
-              <w:spacing w:after="80"/>
-              <w:jc w:val="left"/>
-            </w:pPr>
-            <w:r>
-              <w:rPr>
-                <w:rFonts w:ascii="Arial" w:cs="Arial" w:eastAsia="Arial" w:hAnsi="Arial"/>
-                <w:sz w:val="19"/>
-                <w:szCs w:val="19"/>
-              </w:rPr>
-              <w:t xml:space="preserve">5. Follow up on clients until the order is confirmed and paid; coordinate the scheduling of work with the Company team.</w:t>
-            </w:r>
-          </w:p>
-        </w:tc>
-        <w:tc>
-          <w:tcPr>
-            <w:tcW w:type="dxa" w:w="4953"/>
-            <w:tcBorders>
-              <w:top w:val="single" w:color="BFBFBF" w:sz="4"/>
-              <w:left w:val="single" w:color="BFBFBF" w:sz="4"/>
-              <w:bottom w:val="single" w:color="BFBFBF" w:sz="4"/>
-              <w:right w:val="single" w:color="BFBFBF" w:sz="4"/>
-            </w:tcBorders>
-            <w:tcMar>
-              <w:top w:type="dxa" w:w="60"/>
-              <w:left w:type="dxa" w:w="100"/>
-              <w:bottom w:type="dxa" w:w="60"/>
-              <w:right w:type="dxa" w:w="100"/>
-            </w:tcMar>
-          </w:tcPr>
-          <w:p>
-            <w:pPr>
-              <w:spacing w:after="80"/>
-              <w:jc w:val="left"/>
-            </w:pPr>
-            <w:r>
-              <w:rPr>
-                <w:rFonts w:ascii="Arial" w:cs="Arial" w:eastAsia="Arial" w:hAnsi="Arial"/>
-                <w:sz w:val="19"/>
-                <w:szCs w:val="19"/>
-              </w:rPr>
-              <w:t xml:space="preserve">5. Menindaklanjuti klien hingga pesanan dikonfirmasi dan dibayar; mengoordinasikan jadwal pekerjaan dengan tim Perusahaan.</w:t>
-            </w:r>
-          </w:p>
-        </w:tc>
-      </w:tr>
-      <w:tr>
-        <w:trPr>
-          <w:cantSplit w:val="false"/>
-        </w:trPr>
-        <w:tc>
-          <w:tcPr>
-            <w:tcW w:type="dxa" w:w="4953"/>
-            <w:tcBorders>
-              <w:top w:val="single" w:color="BFBFBF" w:sz="4"/>
-              <w:left w:val="single" w:color="BFBFBF" w:sz="4"/>
-              <w:bottom w:val="single" w:color="BFBFBF" w:sz="4"/>
-              <w:right w:val="single" w:color="BFBFBF" w:sz="4"/>
-            </w:tcBorders>
-            <w:tcMar>
-              <w:top w:type="dxa" w:w="60"/>
-              <w:left w:type="dxa" w:w="100"/>
-              <w:bottom w:type="dxa" w:w="60"/>
-              <w:right w:type="dxa" w:w="100"/>
-            </w:tcMar>
-          </w:tcPr>
-          <w:p>
-            <w:pPr>
-              <w:spacing w:after="80"/>
-              <w:jc w:val="left"/>
-            </w:pPr>
-            <w:r>
-              <w:rPr>
-                <w:rFonts w:ascii="Arial" w:cs="Arial" w:eastAsia="Arial" w:hAnsi="Arial"/>
-                <w:sz w:val="19"/>
-                <w:szCs w:val="19"/>
-              </w:rPr>
-              <w:t xml:space="preserve">6. Monitor client satisfaction after the work and handle repeat orders.</w:t>
-            </w:r>
-          </w:p>
-        </w:tc>
-        <w:tc>
-          <w:tcPr>
-            <w:tcW w:type="dxa" w:w="4953"/>
-            <w:tcBorders>
-              <w:top w:val="single" w:color="BFBFBF" w:sz="4"/>
-              <w:left w:val="single" w:color="BFBFBF" w:sz="4"/>
-              <w:bottom w:val="single" w:color="BFBFBF" w:sz="4"/>
-              <w:right w:val="single" w:color="BFBFBF" w:sz="4"/>
-            </w:tcBorders>
-            <w:tcMar>
-              <w:top w:type="dxa" w:w="60"/>
-              <w:left w:type="dxa" w:w="100"/>
-              <w:bottom w:type="dxa" w:w="60"/>
-              <w:right w:type="dxa" w:w="100"/>
-            </w:tcMar>
-          </w:tcPr>
-          <w:p>
-            <w:pPr>
-              <w:spacing w:after="80"/>
-              <w:jc w:val="left"/>
-            </w:pPr>
-            <w:r>
-              <w:rPr>
-                <w:rFonts w:ascii="Arial" w:cs="Arial" w:eastAsia="Arial" w:hAnsi="Arial"/>
-                <w:sz w:val="19"/>
-                <w:szCs w:val="19"/>
-              </w:rPr>
-              <w:t xml:space="preserve">6. Memantau kepuasan klien setelah pekerjaan dan menangani pesanan ulang.</w:t>
-            </w:r>
-          </w:p>
-        </w:tc>
-      </w:tr>
-      <w:tr>
-        <w:trPr>
-          <w:cantSplit w:val="false"/>
-        </w:trPr>
-        <w:tc>
-          <w:tcPr>
-            <w:tcW w:type="dxa" w:w="4953"/>
-            <w:tcBorders>
-              <w:top w:val="single" w:color="BFBFBF" w:sz="4"/>
-              <w:left w:val="single" w:color="BFBFBF" w:sz="4"/>
-              <w:bottom w:val="single" w:color="BFBFBF" w:sz="4"/>
-              <w:right w:val="single" w:color="BFBFBF" w:sz="4"/>
-            </w:tcBorders>
-            <w:tcMar>
-              <w:top w:type="dxa" w:w="60"/>
-              <w:left w:type="dxa" w:w="100"/>
-              <w:bottom w:type="dxa" w:w="60"/>
-              <w:right w:type="dxa" w:w="100"/>
-            </w:tcMar>
-          </w:tcPr>
-          <w:p>
-            <w:pPr>
-              <w:spacing w:after="80"/>
-              <w:jc w:val="left"/>
-            </w:pPr>
-            <w:r>
-              <w:rPr>
-                <w:rFonts w:ascii="Arial" w:cs="Arial" w:eastAsia="Arial" w:hAnsi="Arial"/>
-                <w:sz w:val="19"/>
-                <w:szCs w:val="19"/>
-              </w:rPr>
-              <w:t xml:space="preserve">7. Submit weekly plans and daily reports (Article 9.2).</w:t>
-            </w:r>
-          </w:p>
-        </w:tc>
-        <w:tc>
-          <w:tcPr>
-            <w:tcW w:type="dxa" w:w="4953"/>
-            <w:tcBorders>
-              <w:top w:val="single" w:color="BFBFBF" w:sz="4"/>
-              <w:left w:val="single" w:color="BFBFBF" w:sz="4"/>
-              <w:bottom w:val="single" w:color="BFBFBF" w:sz="4"/>
-              <w:right w:val="single" w:color="BFBFBF" w:sz="4"/>
-            </w:tcBorders>
-            <w:tcMar>
-              <w:top w:type="dxa" w:w="60"/>
-              <w:left w:type="dxa" w:w="100"/>
-              <w:bottom w:type="dxa" w:w="60"/>
-              <w:right w:type="dxa" w:w="100"/>
-            </w:tcMar>
-          </w:tcPr>
-          <w:p>
-            <w:pPr>
-              <w:spacing w:after="80"/>
-              <w:jc w:val="left"/>
-            </w:pPr>
-            <w:r>
-              <w:rPr>
-                <w:rFonts w:ascii="Arial" w:cs="Arial" w:eastAsia="Arial" w:hAnsi="Arial"/>
-                <w:sz w:val="19"/>
-                <w:szCs w:val="19"/>
-              </w:rPr>
-              <w:t xml:space="preserve">7. Menyerahkan rencana mingguan dan laporan harian (Pasal 9.2).</w:t>
-            </w:r>
-          </w:p>
-        </w:tc>
-      </w:tr>
-      <w:tr>
-        <w:trPr>
-          <w:cantSplit w:val="false"/>
-        </w:trPr>
-        <w:tc>
-          <w:tcPr>
-            <w:tcW w:type="dxa" w:w="4953"/>
-            <w:tcBorders>
-              <w:top w:val="single" w:color="BFBFBF" w:sz="4"/>
-              <w:left w:val="single" w:color="BFBFBF" w:sz="4"/>
-              <w:bottom w:val="single" w:color="BFBFBF" w:sz="4"/>
-              <w:right w:val="single" w:color="BFBFBF" w:sz="4"/>
-            </w:tcBorders>
-            <w:tcMar>
-              <w:top w:type="dxa" w:w="60"/>
-              <w:left w:type="dxa" w:w="100"/>
-              <w:bottom w:type="dxa" w:w="60"/>
-              <w:right w:type="dxa" w:w="100"/>
-            </w:tcMar>
-          </w:tcPr>
-          <w:p>
-            <w:pPr>
-              <w:spacing w:after="80"/>
-              <w:jc w:val="left"/>
-            </w:pPr>
-            <w:r>
-              <w:rPr>
-                <w:rFonts w:ascii="Arial" w:cs="Arial" w:eastAsia="Arial" w:hAnsi="Arial"/>
-                <w:sz w:val="19"/>
-                <w:szCs w:val="19"/>
-              </w:rPr>
-              <w:t xml:space="preserve">8. </w:t>
-            </w:r>
-            <w:r>
-              <w:rPr>
-                <w:rFonts w:ascii="Arial" w:cs="Arial" w:eastAsia="Arial" w:hAnsi="Arial"/>
-                <w:sz w:val="19"/>
-                <w:szCs w:val="19"/>
-                <w:highlight w:val="yellow"/>
-                <w:highlightCs w:val="yellow"/>
-              </w:rPr>
-              <w:t xml:space="preserve">[Other: ________________________]</w:t>
-            </w:r>
-          </w:p>
-        </w:tc>
-        <w:tc>
-          <w:tcPr>
-            <w:tcW w:type="dxa" w:w="4953"/>
-            <w:tcBorders>
-              <w:top w:val="single" w:color="BFBFBF" w:sz="4"/>
-              <w:left w:val="single" w:color="BFBFBF" w:sz="4"/>
-              <w:bottom w:val="single" w:color="BFBFBF" w:sz="4"/>
-              <w:right w:val="single" w:color="BFBFBF" w:sz="4"/>
-            </w:tcBorders>
-            <w:tcMar>
-              <w:top w:type="dxa" w:w="60"/>
-              <w:left w:type="dxa" w:w="100"/>
-              <w:bottom w:type="dxa" w:w="60"/>
-              <w:right w:type="dxa" w:w="100"/>
-            </w:tcMar>
-          </w:tcPr>
-          <w:p>
-            <w:pPr>
-              <w:spacing w:after="80"/>
-              <w:jc w:val="left"/>
-            </w:pPr>
-            <w:r>
-              <w:rPr>
-                <w:rFonts w:ascii="Arial" w:cs="Arial" w:eastAsia="Arial" w:hAnsi="Arial"/>
-                <w:sz w:val="19"/>
-                <w:szCs w:val="19"/>
-              </w:rPr>
-              <w:t xml:space="preserve">8. </w:t>
-            </w:r>
-            <w:r>
-              <w:rPr>
-                <w:rFonts w:ascii="Arial" w:cs="Arial" w:eastAsia="Arial" w:hAnsi="Arial"/>
-                <w:sz w:val="19"/>
-                <w:szCs w:val="19"/>
-                <w:highlight w:val="yellow"/>
-                <w:highlightCs w:val="yellow"/>
-              </w:rPr>
-              <w:t xml:space="preserve">[Lainnya: ________________________]</w:t>
+              <w:t xml:space="preserve">2. Visit clients on site to inspect properties, take measurements and present solutions (waterproofing, mold remediation, villa care).</w:t>
+            </w:r>
+          </w:p>
+        </w:tc>
+        <w:tc>
+          <w:tcPr>
+            <w:tcW w:type="dxa" w:w="4953"/>
+            <w:tcBorders>
+              <w:top w:val="single" w:color="BFBFBF" w:sz="4"/>
+              <w:left w:val="single" w:color="BFBFBF" w:sz="4"/>
+              <w:bottom w:val="single" w:color="BFBFBF" w:sz="4"/>
+              <w:right w:val="single" w:color="BFBFBF" w:sz="4"/>
+            </w:tcBorders>
+            <w:tcMar>
+              <w:top w:type="dxa" w:w="60"/>
+              <w:left w:type="dxa" w:w="100"/>
+              <w:bottom w:type="dxa" w:w="60"/>
+              <w:right w:type="dxa" w:w="100"/>
+            </w:tcMar>
+          </w:tcPr>
+          <w:p>
+            <w:pPr>
+              <w:spacing w:after="80"/>
+              <w:jc w:val="left"/>
+            </w:pPr>
+            <w:r>
+              <w:rPr>
+                <w:rFonts w:ascii="Arial" w:cs="Arial" w:eastAsia="Arial" w:hAnsi="Arial"/>
+                <w:sz w:val="19"/>
+                <w:szCs w:val="19"/>
+              </w:rPr>
+              <w:t xml:space="preserve">2. Mengunjungi klien di lokasi untuk memeriksa properti, melakukan pengukuran dan mempresentasikan solusi (waterproofing, penanganan jamur, perawatan villa).</w:t>
+            </w:r>
+          </w:p>
+        </w:tc>
+      </w:tr>
+      <w:tr>
+        <w:trPr>
+          <w:cantSplit w:val="false"/>
+        </w:trPr>
+        <w:tc>
+          <w:tcPr>
+            <w:tcW w:type="dxa" w:w="4953"/>
+            <w:tcBorders>
+              <w:top w:val="single" w:color="BFBFBF" w:sz="4"/>
+              <w:left w:val="single" w:color="BFBFBF" w:sz="4"/>
+              <w:bottom w:val="single" w:color="BFBFBF" w:sz="4"/>
+              <w:right w:val="single" w:color="BFBFBF" w:sz="4"/>
+            </w:tcBorders>
+            <w:tcMar>
+              <w:top w:type="dxa" w:w="60"/>
+              <w:left w:type="dxa" w:w="100"/>
+              <w:bottom w:type="dxa" w:w="60"/>
+              <w:right w:type="dxa" w:w="100"/>
+            </w:tcMar>
+          </w:tcPr>
+          <w:p>
+            <w:pPr>
+              <w:spacing w:after="80"/>
+              <w:jc w:val="left"/>
+            </w:pPr>
+            <w:r>
+              <w:rPr>
+                <w:rFonts w:ascii="Arial" w:cs="Arial" w:eastAsia="Arial" w:hAnsi="Arial"/>
+                <w:sz w:val="19"/>
+                <w:szCs w:val="19"/>
+              </w:rPr>
+              <w:t xml:space="preserve">3. Prepare and deliver commercial proposals during the visit, and issue invoices on behalf of the Company according to the price list.</w:t>
+            </w:r>
+          </w:p>
+        </w:tc>
+        <w:tc>
+          <w:tcPr>
+            <w:tcW w:type="dxa" w:w="4953"/>
+            <w:tcBorders>
+              <w:top w:val="single" w:color="BFBFBF" w:sz="4"/>
+              <w:left w:val="single" w:color="BFBFBF" w:sz="4"/>
+              <w:bottom w:val="single" w:color="BFBFBF" w:sz="4"/>
+              <w:right w:val="single" w:color="BFBFBF" w:sz="4"/>
+            </w:tcBorders>
+            <w:tcMar>
+              <w:top w:type="dxa" w:w="60"/>
+              <w:left w:type="dxa" w:w="100"/>
+              <w:bottom w:type="dxa" w:w="60"/>
+              <w:right w:type="dxa" w:w="100"/>
+            </w:tcMar>
+          </w:tcPr>
+          <w:p>
+            <w:pPr>
+              <w:spacing w:after="80"/>
+              <w:jc w:val="left"/>
+            </w:pPr>
+            <w:r>
+              <w:rPr>
+                <w:rFonts w:ascii="Arial" w:cs="Arial" w:eastAsia="Arial" w:hAnsi="Arial"/>
+                <w:sz w:val="19"/>
+                <w:szCs w:val="19"/>
+              </w:rPr>
+              <w:t xml:space="preserve">3. Menyiapkan dan menyampaikan penawaran komersial saat kunjungan, serta menerbitkan invoice atas nama Perusahaan sesuai daftar harga.</w:t>
+            </w:r>
+          </w:p>
+        </w:tc>
+      </w:tr>
+      <w:tr>
+        <w:trPr>
+          <w:cantSplit w:val="false"/>
+        </w:trPr>
+        <w:tc>
+          <w:tcPr>
+            <w:tcW w:type="dxa" w:w="4953"/>
+            <w:tcBorders>
+              <w:top w:val="single" w:color="BFBFBF" w:sz="4"/>
+              <w:left w:val="single" w:color="BFBFBF" w:sz="4"/>
+              <w:bottom w:val="single" w:color="BFBFBF" w:sz="4"/>
+              <w:right w:val="single" w:color="BFBFBF" w:sz="4"/>
+            </w:tcBorders>
+            <w:tcMar>
+              <w:top w:type="dxa" w:w="60"/>
+              <w:left w:type="dxa" w:w="100"/>
+              <w:bottom w:type="dxa" w:w="60"/>
+              <w:right w:type="dxa" w:w="100"/>
+            </w:tcMar>
+          </w:tcPr>
+          <w:p>
+            <w:pPr>
+              <w:spacing w:after="80"/>
+              <w:jc w:val="left"/>
+            </w:pPr>
+            <w:r>
+              <w:rPr>
+                <w:rFonts w:ascii="Arial" w:cs="Arial" w:eastAsia="Arial" w:hAnsi="Arial"/>
+                <w:sz w:val="19"/>
+                <w:szCs w:val="19"/>
+              </w:rPr>
+              <w:t xml:space="preserve">4. Sell the Company's services and materials; negotiate and correspond with clients, including foreign clients in English.</w:t>
+            </w:r>
+          </w:p>
+        </w:tc>
+        <w:tc>
+          <w:tcPr>
+            <w:tcW w:type="dxa" w:w="4953"/>
+            <w:tcBorders>
+              <w:top w:val="single" w:color="BFBFBF" w:sz="4"/>
+              <w:left w:val="single" w:color="BFBFBF" w:sz="4"/>
+              <w:bottom w:val="single" w:color="BFBFBF" w:sz="4"/>
+              <w:right w:val="single" w:color="BFBFBF" w:sz="4"/>
+            </w:tcBorders>
+            <w:tcMar>
+              <w:top w:type="dxa" w:w="60"/>
+              <w:left w:type="dxa" w:w="100"/>
+              <w:bottom w:type="dxa" w:w="60"/>
+              <w:right w:type="dxa" w:w="100"/>
+            </w:tcMar>
+          </w:tcPr>
+          <w:p>
+            <w:pPr>
+              <w:spacing w:after="80"/>
+              <w:jc w:val="left"/>
+            </w:pPr>
+            <w:r>
+              <w:rPr>
+                <w:rFonts w:ascii="Arial" w:cs="Arial" w:eastAsia="Arial" w:hAnsi="Arial"/>
+                <w:sz w:val="19"/>
+                <w:szCs w:val="19"/>
+              </w:rPr>
+              <w:t xml:space="preserve">4. Menjual jasa dan bahan Perusahaan; bernegosiasi dan berkorespondensi dengan klien, termasuk klien asing dalam bahasa Inggris.</w:t>
+            </w:r>
+          </w:p>
+        </w:tc>
+      </w:tr>
+      <w:tr>
+        <w:trPr>
+          <w:cantSplit w:val="false"/>
+        </w:trPr>
+        <w:tc>
+          <w:tcPr>
+            <w:tcW w:type="dxa" w:w="4953"/>
+            <w:tcBorders>
+              <w:top w:val="single" w:color="BFBFBF" w:sz="4"/>
+              <w:left w:val="single" w:color="BFBFBF" w:sz="4"/>
+              <w:bottom w:val="single" w:color="BFBFBF" w:sz="4"/>
+              <w:right w:val="single" w:color="BFBFBF" w:sz="4"/>
+            </w:tcBorders>
+            <w:tcMar>
+              <w:top w:type="dxa" w:w="60"/>
+              <w:left w:type="dxa" w:w="100"/>
+              <w:bottom w:type="dxa" w:w="60"/>
+              <w:right w:type="dxa" w:w="100"/>
+            </w:tcMar>
+          </w:tcPr>
+          <w:p>
+            <w:pPr>
+              <w:spacing w:after="80"/>
+              <w:jc w:val="left"/>
+            </w:pPr>
+            <w:r>
+              <w:rPr>
+                <w:rFonts w:ascii="Arial" w:cs="Arial" w:eastAsia="Arial" w:hAnsi="Arial"/>
+                <w:sz w:val="19"/>
+                <w:szCs w:val="19"/>
+              </w:rPr>
+              <w:t xml:space="preserve">5. Coordinate and close deals: follow up until the order is confirmed and paid; coordinate work scheduling with the Company team.</w:t>
+            </w:r>
+          </w:p>
+        </w:tc>
+        <w:tc>
+          <w:tcPr>
+            <w:tcW w:type="dxa" w:w="4953"/>
+            <w:tcBorders>
+              <w:top w:val="single" w:color="BFBFBF" w:sz="4"/>
+              <w:left w:val="single" w:color="BFBFBF" w:sz="4"/>
+              <w:bottom w:val="single" w:color="BFBFBF" w:sz="4"/>
+              <w:right w:val="single" w:color="BFBFBF" w:sz="4"/>
+            </w:tcBorders>
+            <w:tcMar>
+              <w:top w:type="dxa" w:w="60"/>
+              <w:left w:type="dxa" w:w="100"/>
+              <w:bottom w:type="dxa" w:w="60"/>
+              <w:right w:type="dxa" w:w="100"/>
+            </w:tcMar>
+          </w:tcPr>
+          <w:p>
+            <w:pPr>
+              <w:spacing w:after="80"/>
+              <w:jc w:val="left"/>
+            </w:pPr>
+            <w:r>
+              <w:rPr>
+                <w:rFonts w:ascii="Arial" w:cs="Arial" w:eastAsia="Arial" w:hAnsi="Arial"/>
+                <w:sz w:val="19"/>
+                <w:szCs w:val="19"/>
+              </w:rPr>
+              <w:t xml:space="preserve">5. Mengoordinasikan dan menutup transaksi: menindaklanjuti hingga pesanan dikonfirmasi dan dibayar; mengoordinasikan jadwal pekerjaan dengan tim Perusahaan.</w:t>
+            </w:r>
+          </w:p>
+        </w:tc>
+      </w:tr>
+      <w:tr>
+        <w:trPr>
+          <w:cantSplit w:val="false"/>
+        </w:trPr>
+        <w:tc>
+          <w:tcPr>
+            <w:tcW w:type="dxa" w:w="4953"/>
+            <w:tcBorders>
+              <w:top w:val="single" w:color="BFBFBF" w:sz="4"/>
+              <w:left w:val="single" w:color="BFBFBF" w:sz="4"/>
+              <w:bottom w:val="single" w:color="BFBFBF" w:sz="4"/>
+              <w:right w:val="single" w:color="BFBFBF" w:sz="4"/>
+            </w:tcBorders>
+            <w:tcMar>
+              <w:top w:type="dxa" w:w="60"/>
+              <w:left w:type="dxa" w:w="100"/>
+              <w:bottom w:type="dxa" w:w="60"/>
+              <w:right w:type="dxa" w:w="100"/>
+            </w:tcMar>
+          </w:tcPr>
+          <w:p>
+            <w:pPr>
+              <w:spacing w:after="80"/>
+              <w:jc w:val="left"/>
+            </w:pPr>
+            <w:r>
+              <w:rPr>
+                <w:rFonts w:ascii="Arial" w:cs="Arial" w:eastAsia="Arial" w:hAnsi="Arial"/>
+                <w:sz w:val="19"/>
+                <w:szCs w:val="19"/>
+              </w:rPr>
+              <w:t xml:space="preserve">6. Track material usage and verify the volume of completed work on client sites.</w:t>
+            </w:r>
+          </w:p>
+        </w:tc>
+        <w:tc>
+          <w:tcPr>
+            <w:tcW w:type="dxa" w:w="4953"/>
+            <w:tcBorders>
+              <w:top w:val="single" w:color="BFBFBF" w:sz="4"/>
+              <w:left w:val="single" w:color="BFBFBF" w:sz="4"/>
+              <w:bottom w:val="single" w:color="BFBFBF" w:sz="4"/>
+              <w:right w:val="single" w:color="BFBFBF" w:sz="4"/>
+            </w:tcBorders>
+            <w:tcMar>
+              <w:top w:type="dxa" w:w="60"/>
+              <w:left w:type="dxa" w:w="100"/>
+              <w:bottom w:type="dxa" w:w="60"/>
+              <w:right w:type="dxa" w:w="100"/>
+            </w:tcMar>
+          </w:tcPr>
+          <w:p>
+            <w:pPr>
+              <w:spacing w:after="80"/>
+              <w:jc w:val="left"/>
+            </w:pPr>
+            <w:r>
+              <w:rPr>
+                <w:rFonts w:ascii="Arial" w:cs="Arial" w:eastAsia="Arial" w:hAnsi="Arial"/>
+                <w:sz w:val="19"/>
+                <w:szCs w:val="19"/>
+              </w:rPr>
+              <w:t xml:space="preserve">6. Memantau penggunaan bahan dan memverifikasi volume pekerjaan yang telah diselesaikan di lokasi klien.</w:t>
+            </w:r>
+          </w:p>
+        </w:tc>
+      </w:tr>
+      <w:tr>
+        <w:trPr>
+          <w:cantSplit w:val="false"/>
+        </w:trPr>
+        <w:tc>
+          <w:tcPr>
+            <w:tcW w:type="dxa" w:w="4953"/>
+            <w:tcBorders>
+              <w:top w:val="single" w:color="BFBFBF" w:sz="4"/>
+              <w:left w:val="single" w:color="BFBFBF" w:sz="4"/>
+              <w:bottom w:val="single" w:color="BFBFBF" w:sz="4"/>
+              <w:right w:val="single" w:color="BFBFBF" w:sz="4"/>
+            </w:tcBorders>
+            <w:tcMar>
+              <w:top w:type="dxa" w:w="60"/>
+              <w:left w:type="dxa" w:w="100"/>
+              <w:bottom w:type="dxa" w:w="60"/>
+              <w:right w:type="dxa" w:w="100"/>
+            </w:tcMar>
+          </w:tcPr>
+          <w:p>
+            <w:pPr>
+              <w:spacing w:after="80"/>
+              <w:jc w:val="left"/>
+            </w:pPr>
+            <w:r>
+              <w:rPr>
+                <w:rFonts w:ascii="Arial" w:cs="Arial" w:eastAsia="Arial" w:hAnsi="Arial"/>
+                <w:sz w:val="19"/>
+                <w:szCs w:val="19"/>
+              </w:rPr>
+              <w:t xml:space="preserve">7. Assist the Company with hiring technical staff.</w:t>
+            </w:r>
+          </w:p>
+        </w:tc>
+        <w:tc>
+          <w:tcPr>
+            <w:tcW w:type="dxa" w:w="4953"/>
+            <w:tcBorders>
+              <w:top w:val="single" w:color="BFBFBF" w:sz="4"/>
+              <w:left w:val="single" w:color="BFBFBF" w:sz="4"/>
+              <w:bottom w:val="single" w:color="BFBFBF" w:sz="4"/>
+              <w:right w:val="single" w:color="BFBFBF" w:sz="4"/>
+            </w:tcBorders>
+            <w:tcMar>
+              <w:top w:type="dxa" w:w="60"/>
+              <w:left w:type="dxa" w:w="100"/>
+              <w:bottom w:type="dxa" w:w="60"/>
+              <w:right w:type="dxa" w:w="100"/>
+            </w:tcMar>
+          </w:tcPr>
+          <w:p>
+            <w:pPr>
+              <w:spacing w:after="80"/>
+              <w:jc w:val="left"/>
+            </w:pPr>
+            <w:r>
+              <w:rPr>
+                <w:rFonts w:ascii="Arial" w:cs="Arial" w:eastAsia="Arial" w:hAnsi="Arial"/>
+                <w:sz w:val="19"/>
+                <w:szCs w:val="19"/>
+              </w:rPr>
+              <w:t xml:space="preserve">7. Membantu Perusahaan dalam perekrutan tenaga teknis.</w:t>
+            </w:r>
+          </w:p>
+        </w:tc>
+      </w:tr>
+      <w:tr>
+        <w:trPr>
+          <w:cantSplit w:val="false"/>
+        </w:trPr>
+        <w:tc>
+          <w:tcPr>
+            <w:tcW w:type="dxa" w:w="4953"/>
+            <w:tcBorders>
+              <w:top w:val="single" w:color="BFBFBF" w:sz="4"/>
+              <w:left w:val="single" w:color="BFBFBF" w:sz="4"/>
+              <w:bottom w:val="single" w:color="BFBFBF" w:sz="4"/>
+              <w:right w:val="single" w:color="BFBFBF" w:sz="4"/>
+            </w:tcBorders>
+            <w:tcMar>
+              <w:top w:type="dxa" w:w="60"/>
+              <w:left w:type="dxa" w:w="100"/>
+              <w:bottom w:type="dxa" w:w="60"/>
+              <w:right w:type="dxa" w:w="100"/>
+            </w:tcMar>
+          </w:tcPr>
+          <w:p>
+            <w:pPr>
+              <w:spacing w:after="80"/>
+              <w:jc w:val="left"/>
+            </w:pPr>
+            <w:r>
+              <w:rPr>
+                <w:rFonts w:ascii="Arial" w:cs="Arial" w:eastAsia="Arial" w:hAnsi="Arial"/>
+                <w:sz w:val="19"/>
+                <w:szCs w:val="19"/>
+              </w:rPr>
+              <w:t xml:space="preserve">8. Monitor client satisfaction after the work and handle repeat orders.</w:t>
+            </w:r>
+          </w:p>
+        </w:tc>
+        <w:tc>
+          <w:tcPr>
+            <w:tcW w:type="dxa" w:w="4953"/>
+            <w:tcBorders>
+              <w:top w:val="single" w:color="BFBFBF" w:sz="4"/>
+              <w:left w:val="single" w:color="BFBFBF" w:sz="4"/>
+              <w:bottom w:val="single" w:color="BFBFBF" w:sz="4"/>
+              <w:right w:val="single" w:color="BFBFBF" w:sz="4"/>
+            </w:tcBorders>
+            <w:tcMar>
+              <w:top w:type="dxa" w:w="60"/>
+              <w:left w:type="dxa" w:w="100"/>
+              <w:bottom w:type="dxa" w:w="60"/>
+              <w:right w:type="dxa" w:w="100"/>
+            </w:tcMar>
+          </w:tcPr>
+          <w:p>
+            <w:pPr>
+              <w:spacing w:after="80"/>
+              <w:jc w:val="left"/>
+            </w:pPr>
+            <w:r>
+              <w:rPr>
+                <w:rFonts w:ascii="Arial" w:cs="Arial" w:eastAsia="Arial" w:hAnsi="Arial"/>
+                <w:sz w:val="19"/>
+                <w:szCs w:val="19"/>
+              </w:rPr>
+              <w:t xml:space="preserve">8. Memantau kepuasan klien setelah pekerjaan dan menangani pesanan ulang.</w:t>
+            </w:r>
+          </w:p>
+        </w:tc>
+      </w:tr>
+      <w:tr>
+        <w:trPr>
+          <w:cantSplit w:val="false"/>
+        </w:trPr>
+        <w:tc>
+          <w:tcPr>
+            <w:tcW w:type="dxa" w:w="4953"/>
+            <w:tcBorders>
+              <w:top w:val="single" w:color="BFBFBF" w:sz="4"/>
+              <w:left w:val="single" w:color="BFBFBF" w:sz="4"/>
+              <w:bottom w:val="single" w:color="BFBFBF" w:sz="4"/>
+              <w:right w:val="single" w:color="BFBFBF" w:sz="4"/>
+            </w:tcBorders>
+            <w:tcMar>
+              <w:top w:type="dxa" w:w="60"/>
+              <w:left w:type="dxa" w:w="100"/>
+              <w:bottom w:type="dxa" w:w="60"/>
+              <w:right w:type="dxa" w:w="100"/>
+            </w:tcMar>
+          </w:tcPr>
+          <w:p>
+            <w:pPr>
+              <w:spacing w:after="80"/>
+              <w:jc w:val="left"/>
+            </w:pPr>
+            <w:r>
+              <w:rPr>
+                <w:rFonts w:ascii="Arial" w:cs="Arial" w:eastAsia="Arial" w:hAnsi="Arial"/>
+                <w:sz w:val="19"/>
+                <w:szCs w:val="19"/>
+              </w:rPr>
+              <w:t xml:space="preserve">9. Submit weekly plans and daily reports (Article 9.2).</w:t>
+            </w:r>
+          </w:p>
+        </w:tc>
+        <w:tc>
+          <w:tcPr>
+            <w:tcW w:type="dxa" w:w="4953"/>
+            <w:tcBorders>
+              <w:top w:val="single" w:color="BFBFBF" w:sz="4"/>
+              <w:left w:val="single" w:color="BFBFBF" w:sz="4"/>
+              <w:bottom w:val="single" w:color="BFBFBF" w:sz="4"/>
+              <w:right w:val="single" w:color="BFBFBF" w:sz="4"/>
+            </w:tcBorders>
+            <w:tcMar>
+              <w:top w:type="dxa" w:w="60"/>
+              <w:left w:type="dxa" w:w="100"/>
+              <w:bottom w:type="dxa" w:w="60"/>
+              <w:right w:type="dxa" w:w="100"/>
+            </w:tcMar>
+          </w:tcPr>
+          <w:p>
+            <w:pPr>
+              <w:spacing w:after="80"/>
+              <w:jc w:val="left"/>
+            </w:pPr>
+            <w:r>
+              <w:rPr>
+                <w:rFonts w:ascii="Arial" w:cs="Arial" w:eastAsia="Arial" w:hAnsi="Arial"/>
+                <w:sz w:val="19"/>
+                <w:szCs w:val="19"/>
+              </w:rPr>
+              <w:t xml:space="preserve">9. Menyerahkan rencana mingguan dan laporan harian (Pasal 9.2).</w:t>
             </w:r>
           </w:p>
         </w:tc>

</xml_diff>